<commit_message>
feature: trained and validated models for [100T,10D], [100T,20D], [200T,10D], [200T,20D]
</commit_message>
<xml_diff>
--- a/docs/Experiment-Paper.docx
+++ b/docs/Experiment-Paper.docx
@@ -12,16 +12,130 @@
           <w:b/>
           <w:bCs/>
         </w:rPr>
-        <w:t>Objective:</w:t>
-      </w:r>
-      <w:r>
-        <w:t xml:space="preserve"> To evaluate the performance of the Random</w:t>
+        <w:t>Classification Outcomes:</w:t>
       </w:r>
       <w:r>
         <w:t xml:space="preserve"> </w:t>
       </w:r>
-      <w:r>
-        <w:t>Forest-SMOTE (RF-SMOTE) model compared to the benchmark Random Forest (RF) model.</w:t>
+    </w:p>
+    <w:p>
+      <w:pPr>
+        <w:spacing w:line="480" w:lineRule="auto"/>
+        <w:ind w:firstLine="720"/>
+        <w:jc w:val="both"/>
+      </w:pPr>
+      <w:r>
+        <w:t xml:space="preserve">To evaluate the performance of the Random Forest-SMOTE (RF-SMOTE) model against the benchmark Random Forest (RF) model, confusion matrices will be used. </w:t>
+      </w:r>
+      <w:r>
+        <w:t xml:space="preserve">Table 1 will serve as the confusion matrix for </w:t>
+      </w:r>
+      <w:r>
+        <w:t>the Random Forest Model</w:t>
+      </w:r>
+      <w:r>
+        <w:t xml:space="preserve">, and Table 2 will serve as the confusion matric for the </w:t>
+      </w:r>
+      <w:r>
+        <w:t>Random Forest-SMOTE Model</w:t>
+      </w:r>
+      <w:r>
+        <w:t>.</w:t>
+      </w:r>
+    </w:p>
+    <w:p>
+      <w:pPr>
+        <w:spacing w:line="480" w:lineRule="auto"/>
+        <w:ind w:firstLine="720"/>
+        <w:jc w:val="both"/>
+      </w:pPr>
+      <w:r>
+        <w:t xml:space="preserve">Both models will be evaluated using the same </w:t>
+      </w:r>
+      <w:proofErr w:type="spellStart"/>
+      <w:r>
+        <w:t>PaySim</w:t>
+      </w:r>
+      <w:proofErr w:type="spellEnd"/>
+      <w:r>
+        <w:t xml:space="preserve"> test dataset to ensure a consistent and fair comparison. </w:t>
+      </w:r>
+      <w:r>
+        <w:t xml:space="preserve">Moreover, </w:t>
+      </w:r>
+      <w:r>
+        <w:t>Fraudulent transactions will be treated as the positive class</w:t>
+      </w:r>
+      <w:r>
+        <w:t>, and f</w:t>
+      </w:r>
+      <w:r>
+        <w:t>or each transaction, the actual class label will be compared with the predicted label produced by each model to determine the corresponding confusion matrix outcomes</w:t>
+      </w:r>
+      <w:r>
+        <w:t>:</w:t>
+      </w:r>
+    </w:p>
+    <w:p>
+      <w:pPr>
+        <w:pStyle w:val="ListParagraph"/>
+        <w:numPr>
+          <w:ilvl w:val="0"/>
+          <w:numId w:val="2"/>
+        </w:numPr>
+        <w:spacing w:line="480" w:lineRule="auto"/>
+        <w:jc w:val="both"/>
+      </w:pPr>
+      <w:r>
+        <w:t>TP (true positive) is the number of fraudulent transactions predicted as fraudulent</w:t>
+      </w:r>
+    </w:p>
+    <w:p>
+      <w:pPr>
+        <w:pStyle w:val="ListParagraph"/>
+        <w:numPr>
+          <w:ilvl w:val="0"/>
+          <w:numId w:val="2"/>
+        </w:numPr>
+        <w:spacing w:line="480" w:lineRule="auto"/>
+        <w:jc w:val="both"/>
+      </w:pPr>
+      <w:r>
+        <w:t>FN (false negative) is the number of fraudulent transactions predicted as legitimate</w:t>
+      </w:r>
+    </w:p>
+    <w:p>
+      <w:pPr>
+        <w:pStyle w:val="ListParagraph"/>
+        <w:numPr>
+          <w:ilvl w:val="0"/>
+          <w:numId w:val="2"/>
+        </w:numPr>
+        <w:spacing w:line="480" w:lineRule="auto"/>
+        <w:jc w:val="both"/>
+      </w:pPr>
+      <w:r>
+        <w:t>FP (false positive) is the number of legitimate transactions predicted as fraudulent</w:t>
+      </w:r>
+    </w:p>
+    <w:p>
+      <w:pPr>
+        <w:pStyle w:val="ListParagraph"/>
+        <w:numPr>
+          <w:ilvl w:val="0"/>
+          <w:numId w:val="2"/>
+        </w:numPr>
+        <w:spacing w:line="480" w:lineRule="auto"/>
+        <w:jc w:val="both"/>
+      </w:pPr>
+      <w:r>
+        <w:t>TN (true negative) is the number of legitimate transactions predicted as legitimate</w:t>
+      </w:r>
+      <w:r>
+        <w:t xml:space="preserve"> </w:t>
+      </w:r>
+      <w:r>
+        <w:t xml:space="preserve"> </w:t>
       </w:r>
     </w:p>
     <w:p>
@@ -112,7 +226,14 @@
                 <w:b/>
                 <w:bCs/>
               </w:rPr>
-              <w:t>Labeled Fraudulent</w:t>
+              <w:t>Predicted</w:t>
+            </w:r>
+            <w:r>
+              <w:rPr>
+                <w:b/>
+                <w:bCs/>
+              </w:rPr>
+              <w:t xml:space="preserve"> Fraudulent</w:t>
             </w:r>
           </w:p>
         </w:tc>
@@ -139,7 +260,14 @@
                 <w:b/>
                 <w:bCs/>
               </w:rPr>
-              <w:t>Labeled Legitimate</w:t>
+              <w:t>Predicted</w:t>
+            </w:r>
+            <w:r>
+              <w:rPr>
+                <w:b/>
+                <w:bCs/>
+              </w:rPr>
+              <w:t xml:space="preserve"> Legitimate</w:t>
             </w:r>
           </w:p>
         </w:tc>
@@ -188,10 +316,17 @@
               <w:spacing w:before="120" w:after="120"/>
               <w:jc w:val="center"/>
               <w:rPr>
-                <w:b/>
-                <w:bCs/>
-              </w:rPr>
-            </w:pPr>
+                <w:i/>
+                <w:iCs/>
+              </w:rPr>
+            </w:pPr>
+            <w:r>
+              <w:rPr>
+                <w:i/>
+                <w:iCs/>
+              </w:rPr>
+              <w:t>TP</w:t>
+            </w:r>
           </w:p>
         </w:tc>
         <w:tc>
@@ -207,7 +342,18 @@
             <w:pPr>
               <w:spacing w:before="120" w:after="120"/>
               <w:jc w:val="center"/>
-            </w:pPr>
+              <w:rPr>
+                <w:i/>
+                <w:iCs/>
+              </w:rPr>
+            </w:pPr>
+            <w:r>
+              <w:rPr>
+                <w:i/>
+                <w:iCs/>
+              </w:rPr>
+              <w:t>FN</w:t>
+            </w:r>
           </w:p>
         </w:tc>
       </w:tr>
@@ -253,10 +399,17 @@
               <w:spacing w:before="120" w:after="120"/>
               <w:jc w:val="center"/>
               <w:rPr>
-                <w:b/>
-                <w:bCs/>
-              </w:rPr>
-            </w:pPr>
+                <w:i/>
+                <w:iCs/>
+              </w:rPr>
+            </w:pPr>
+            <w:r>
+              <w:rPr>
+                <w:i/>
+                <w:iCs/>
+              </w:rPr>
+              <w:t>FP</w:t>
+            </w:r>
           </w:p>
         </w:tc>
         <w:tc>
@@ -271,7 +424,18 @@
             <w:pPr>
               <w:spacing w:before="120" w:after="120"/>
               <w:jc w:val="center"/>
-            </w:pPr>
+              <w:rPr>
+                <w:i/>
+                <w:iCs/>
+              </w:rPr>
+            </w:pPr>
+            <w:r>
+              <w:rPr>
+                <w:i/>
+                <w:iCs/>
+              </w:rPr>
+              <w:t>TN</w:t>
+            </w:r>
           </w:p>
         </w:tc>
       </w:tr>
@@ -283,14 +447,27 @@
     </w:p>
     <w:p>
       <w:pPr>
+        <w:spacing w:line="480" w:lineRule="auto"/>
+      </w:pPr>
+    </w:p>
+    <w:p>
+      <w:pPr>
+        <w:spacing w:line="480" w:lineRule="auto"/>
+      </w:pPr>
+    </w:p>
+    <w:p>
+      <w:pPr>
+        <w:spacing w:line="480" w:lineRule="auto"/>
+      </w:pPr>
+    </w:p>
+    <w:p>
+      <w:pPr>
         <w:spacing w:after="0" w:line="480" w:lineRule="auto"/>
         <w:jc w:val="center"/>
       </w:pPr>
       <w:r>
-        <w:t xml:space="preserve">Table </w:t>
-      </w:r>
-      <w:r>
-        <w:t>2</w:t>
+        <w:lastRenderedPageBreak/>
+        <w:t>Table 2</w:t>
       </w:r>
     </w:p>
     <w:p>
@@ -372,7 +549,14 @@
                 <w:b/>
                 <w:bCs/>
               </w:rPr>
-              <w:t>Labeled Fraudulent</w:t>
+              <w:t>Predicted</w:t>
+            </w:r>
+            <w:r>
+              <w:rPr>
+                <w:b/>
+                <w:bCs/>
+              </w:rPr>
+              <w:t xml:space="preserve"> Fraudulent</w:t>
             </w:r>
           </w:p>
         </w:tc>
@@ -399,7 +583,14 @@
                 <w:b/>
                 <w:bCs/>
               </w:rPr>
-              <w:t>Labeled Legitimate</w:t>
+              <w:t>Predicted</w:t>
+            </w:r>
+            <w:r>
+              <w:rPr>
+                <w:b/>
+                <w:bCs/>
+              </w:rPr>
+              <w:t xml:space="preserve"> Legitimate</w:t>
             </w:r>
           </w:p>
         </w:tc>
@@ -452,6 +643,13 @@
                 <w:bCs/>
               </w:rPr>
             </w:pPr>
+            <w:r>
+              <w:rPr>
+                <w:i/>
+                <w:iCs/>
+              </w:rPr>
+              <w:t>TP</w:t>
+            </w:r>
           </w:p>
         </w:tc>
         <w:tc>
@@ -468,6 +666,13 @@
               <w:spacing w:before="120" w:after="120"/>
               <w:jc w:val="center"/>
             </w:pPr>
+            <w:r>
+              <w:rPr>
+                <w:i/>
+                <w:iCs/>
+              </w:rPr>
+              <w:t>FN</w:t>
+            </w:r>
           </w:p>
         </w:tc>
       </w:tr>
@@ -517,6 +722,13 @@
                 <w:bCs/>
               </w:rPr>
             </w:pPr>
+            <w:r>
+              <w:rPr>
+                <w:i/>
+                <w:iCs/>
+              </w:rPr>
+              <w:t>FP</w:t>
+            </w:r>
           </w:p>
         </w:tc>
         <w:tc>
@@ -532,6 +744,13 @@
               <w:spacing w:before="120" w:after="120"/>
               <w:jc w:val="center"/>
             </w:pPr>
+            <w:r>
+              <w:rPr>
+                <w:i/>
+                <w:iCs/>
+              </w:rPr>
+              <w:t>TN</w:t>
+            </w:r>
           </w:p>
         </w:tc>
       </w:tr>
@@ -543,14 +762,807 @@
     </w:p>
     <w:p>
       <w:pPr>
+        <w:spacing w:line="480" w:lineRule="auto"/>
+        <w:jc w:val="both"/>
+      </w:pPr>
+      <w:r>
+        <w:rPr>
+          <w:b/>
+          <w:bCs/>
+        </w:rPr>
+        <w:t>Evaluation Metrics:</w:t>
+      </w:r>
+      <w:r>
+        <w:t xml:space="preserve"> </w:t>
+      </w:r>
+    </w:p>
+    <w:p>
+      <w:pPr>
+        <w:spacing w:line="480" w:lineRule="auto"/>
+        <w:ind w:firstLine="720"/>
+        <w:jc w:val="both"/>
+      </w:pPr>
+      <w:r>
+        <w:t xml:space="preserve">The following metrics will be used to quantify the performance of the </w:t>
+      </w:r>
+      <w:r>
+        <w:t>model</w:t>
+      </w:r>
+      <w:r>
+        <w:t xml:space="preserve">s: Precision, Recall, F1-Score, MCC, and PR-AUC. </w:t>
+      </w:r>
+      <w:r>
+        <w:t xml:space="preserve">The metrics </w:t>
+      </w:r>
+      <w:r>
+        <w:t>will be</w:t>
+      </w:r>
+      <w:r>
+        <w:t xml:space="preserve"> calculated separately for the Random Forest (RF) and Random Forest-SMOTE (RF-SMOTE) models using their respective Tables 1 and 2</w:t>
+      </w:r>
+      <w:r>
+        <w:t xml:space="preserve">. The computed performance metrics </w:t>
+      </w:r>
+      <w:r>
+        <w:t xml:space="preserve"> will be reflected in Table 3</w:t>
+      </w:r>
+      <w:r>
+        <w:t xml:space="preserve">. </w:t>
+      </w:r>
+      <w:r>
+        <w:t>To compute these performance metrics, the following equations will be used:</w:t>
+      </w:r>
+    </w:p>
+    <w:p>
+      <w:pPr>
+        <w:pStyle w:val="ListParagraph"/>
+        <w:numPr>
+          <w:ilvl w:val="0"/>
+          <w:numId w:val="3"/>
+        </w:numPr>
+        <w:spacing w:line="480" w:lineRule="auto"/>
+        <w:rPr>
+          <w:rFonts w:cs="Arial"/>
+          <w:i/>
+        </w:rPr>
+      </w:pPr>
+      <m:oMath>
+        <m:r>
+          <w:rPr>
+            <w:rFonts w:ascii="Cambria Math" w:hAnsi="Cambria Math" w:cs="Arial"/>
+          </w:rPr>
+          <m:t>Precision=</m:t>
+        </m:r>
+        <m:f>
+          <m:fPr>
+            <m:ctrlPr>
+              <w:rPr>
+                <w:rFonts w:ascii="Cambria Math" w:hAnsi="Cambria Math" w:cs="Arial"/>
+                <w:i/>
+              </w:rPr>
+            </m:ctrlPr>
+          </m:fPr>
+          <m:num>
+            <m:r>
+              <w:rPr>
+                <w:rFonts w:ascii="Cambria Math" w:hAnsi="Cambria Math" w:cs="Arial"/>
+              </w:rPr>
+              <m:t>TP</m:t>
+            </m:r>
+          </m:num>
+          <m:den>
+            <m:r>
+              <w:rPr>
+                <w:rFonts w:ascii="Cambria Math" w:hAnsi="Cambria Math" w:cs="Arial"/>
+              </w:rPr>
+              <m:t>TP+FP</m:t>
+            </m:r>
+          </m:den>
+        </m:f>
+        <m:r>
+          <w:rPr>
+            <w:rFonts w:ascii="Cambria Math" w:hAnsi="Cambria Math" w:cs="Arial"/>
+          </w:rPr>
+          <m:t xml:space="preserve"> </m:t>
+        </m:r>
+      </m:oMath>
+    </w:p>
+    <w:p>
+      <w:pPr>
+        <w:pStyle w:val="ListParagraph"/>
+        <w:numPr>
+          <w:ilvl w:val="0"/>
+          <w:numId w:val="3"/>
+        </w:numPr>
+        <w:spacing w:line="480" w:lineRule="auto"/>
+        <w:rPr>
+          <w:rFonts w:cs="Arial"/>
+          <w:i/>
+        </w:rPr>
+      </w:pPr>
+      <m:oMath>
+        <m:r>
+          <w:rPr>
+            <w:rFonts w:ascii="Cambria Math" w:hAnsi="Cambria Math" w:cs="Arial"/>
+          </w:rPr>
+          <m:t>Recall=</m:t>
+        </m:r>
+        <m:f>
+          <m:fPr>
+            <m:ctrlPr>
+              <w:rPr>
+                <w:rFonts w:ascii="Cambria Math" w:hAnsi="Cambria Math" w:cs="Arial"/>
+                <w:i/>
+              </w:rPr>
+            </m:ctrlPr>
+          </m:fPr>
+          <m:num>
+            <m:r>
+              <w:rPr>
+                <w:rFonts w:ascii="Cambria Math" w:hAnsi="Cambria Math" w:cs="Arial"/>
+              </w:rPr>
+              <m:t>TP</m:t>
+            </m:r>
+          </m:num>
+          <m:den>
+            <m:r>
+              <w:rPr>
+                <w:rFonts w:ascii="Cambria Math" w:hAnsi="Cambria Math" w:cs="Arial"/>
+              </w:rPr>
+              <m:t>TP+FN</m:t>
+            </m:r>
+          </m:den>
+        </m:f>
+        <m:r>
+          <w:rPr>
+            <w:rFonts w:ascii="Cambria Math" w:hAnsi="Cambria Math" w:cs="Arial"/>
+          </w:rPr>
+          <m:t xml:space="preserve"> </m:t>
+        </m:r>
+      </m:oMath>
+    </w:p>
+    <w:p>
+      <w:pPr>
+        <w:pStyle w:val="ListParagraph"/>
+        <w:numPr>
+          <w:ilvl w:val="0"/>
+          <w:numId w:val="3"/>
+        </w:numPr>
+        <w:spacing w:line="480" w:lineRule="auto"/>
+        <w:jc w:val="both"/>
+      </w:pPr>
+      <m:oMath>
+        <m:r>
+          <w:rPr>
+            <w:rFonts w:ascii="Cambria Math" w:hAnsi="Cambria Math" w:cs="Arial"/>
+          </w:rPr>
+          <m:t>F1=2*</m:t>
+        </m:r>
+        <m:f>
+          <m:fPr>
+            <m:ctrlPr>
+              <w:rPr>
+                <w:rFonts w:ascii="Cambria Math" w:hAnsi="Cambria Math" w:cs="Arial"/>
+                <w:i/>
+              </w:rPr>
+            </m:ctrlPr>
+          </m:fPr>
+          <m:num>
+            <m:r>
+              <w:rPr>
+                <w:rFonts w:ascii="Cambria Math" w:hAnsi="Cambria Math" w:cs="Arial"/>
+              </w:rPr>
+              <m:t>TP</m:t>
+            </m:r>
+          </m:num>
+          <m:den>
+            <m:r>
+              <w:rPr>
+                <w:rFonts w:ascii="Cambria Math" w:hAnsi="Cambria Math" w:cs="Arial"/>
+              </w:rPr>
+              <m:t>2TP+F</m:t>
+            </m:r>
+            <m:r>
+              <w:rPr>
+                <w:rFonts w:ascii="Cambria Math" w:hAnsi="Cambria Math" w:cs="Arial"/>
+              </w:rPr>
+              <m:t>P</m:t>
+            </m:r>
+            <m:r>
+              <w:rPr>
+                <w:rFonts w:ascii="Cambria Math" w:hAnsi="Cambria Math" w:cs="Arial"/>
+              </w:rPr>
+              <m:t>+FN</m:t>
+            </m:r>
+          </m:den>
+        </m:f>
+        <m:r>
+          <w:rPr>
+            <w:rFonts w:ascii="Cambria Math" w:hAnsi="Cambria Math" w:cs="Arial"/>
+          </w:rPr>
+          <m:t xml:space="preserve"> </m:t>
+        </m:r>
+      </m:oMath>
+    </w:p>
+    <w:p>
+      <w:pPr>
+        <w:pStyle w:val="ListParagraph"/>
+        <w:numPr>
+          <w:ilvl w:val="0"/>
+          <w:numId w:val="3"/>
+        </w:numPr>
+        <w:spacing w:line="480" w:lineRule="auto"/>
+        <w:rPr>
+          <w:rFonts w:cs="Arial"/>
+          <w:i/>
+        </w:rPr>
+      </w:pPr>
+      <m:oMath>
+        <m:r>
+          <w:rPr>
+            <w:rFonts w:ascii="Cambria Math" w:hAnsi="Cambria Math" w:cs="Arial"/>
+          </w:rPr>
+          <m:t>MCC=</m:t>
+        </m:r>
+        <m:f>
+          <m:fPr>
+            <m:ctrlPr>
+              <w:rPr>
+                <w:rFonts w:ascii="Cambria Math" w:hAnsi="Cambria Math" w:cs="Arial"/>
+                <w:i/>
+              </w:rPr>
+            </m:ctrlPr>
+          </m:fPr>
+          <m:num>
+            <m:r>
+              <w:rPr>
+                <w:rFonts w:ascii="Cambria Math" w:hAnsi="Cambria Math" w:cs="Arial"/>
+              </w:rPr>
+              <m:t>TR*TN-FP*FN</m:t>
+            </m:r>
+          </m:num>
+          <m:den>
+            <m:r>
+              <w:rPr>
+                <w:rFonts w:ascii="Cambria Math" w:hAnsi="Cambria Math" w:cs="Arial"/>
+              </w:rPr>
+              <m:t>√(TP+FP)(TP+FN)(TN+FP)(TN+FN)</m:t>
+            </m:r>
+          </m:den>
+        </m:f>
+      </m:oMath>
+    </w:p>
+    <w:p>
+      <w:pPr>
+        <w:pStyle w:val="ListParagraph"/>
+        <w:numPr>
+          <w:ilvl w:val="0"/>
+          <w:numId w:val="3"/>
+        </w:numPr>
+        <w:spacing w:line="480" w:lineRule="auto"/>
+        <w:rPr>
+          <w:rFonts w:cs="Arial"/>
+          <w:i/>
+        </w:rPr>
+      </w:pPr>
+      <m:oMath>
+        <m:r>
+          <w:rPr>
+            <w:rFonts w:ascii="Cambria Math" w:hAnsi="Cambria Math" w:cs="Arial"/>
+          </w:rPr>
+          <m:t>PR-AUC</m:t>
+        </m:r>
+        <m:r>
+          <w:rPr>
+            <w:rFonts w:ascii="Cambria Math" w:hAnsi="Cambria Math" w:cs="Arial"/>
+          </w:rPr>
+          <m:t>=</m:t>
+        </m:r>
+        <m:nary>
+          <m:naryPr>
+            <m:chr m:val="∑"/>
+            <m:limLoc m:val="undOvr"/>
+            <m:supHide m:val="1"/>
+            <m:ctrlPr>
+              <w:rPr>
+                <w:rFonts w:ascii="Cambria Math" w:hAnsi="Cambria Math" w:cs="Arial"/>
+                <w:i/>
+              </w:rPr>
+            </m:ctrlPr>
+          </m:naryPr>
+          <m:sub>
+            <m:r>
+              <w:rPr>
+                <w:rFonts w:ascii="Cambria Math" w:hAnsi="Cambria Math" w:cs="Arial"/>
+              </w:rPr>
+              <m:t>i</m:t>
+            </m:r>
+          </m:sub>
+          <m:sup/>
+          <m:e>
+            <m:d>
+              <m:dPr>
+                <m:ctrlPr>
+                  <w:rPr>
+                    <w:rFonts w:ascii="Cambria Math" w:hAnsi="Cambria Math" w:cs="Arial"/>
+                    <w:i/>
+                  </w:rPr>
+                </m:ctrlPr>
+              </m:dPr>
+              <m:e>
+                <m:sSub>
+                  <m:sSubPr>
+                    <m:ctrlPr>
+                      <w:rPr>
+                        <w:rFonts w:ascii="Cambria Math" w:hAnsi="Cambria Math" w:cs="Arial"/>
+                        <w:i/>
+                      </w:rPr>
+                    </m:ctrlPr>
+                  </m:sSubPr>
+                  <m:e>
+                    <m:r>
+                      <w:rPr>
+                        <w:rFonts w:ascii="Cambria Math" w:hAnsi="Cambria Math" w:cs="Arial"/>
+                      </w:rPr>
+                      <m:t>R</m:t>
+                    </m:r>
+                  </m:e>
+                  <m:sub>
+                    <m:r>
+                      <w:rPr>
+                        <w:rFonts w:ascii="Cambria Math" w:hAnsi="Cambria Math" w:cs="Arial"/>
+                      </w:rPr>
+                      <m:t>i</m:t>
+                    </m:r>
+                  </m:sub>
+                </m:sSub>
+                <m:r>
+                  <w:rPr>
+                    <w:rFonts w:ascii="Cambria Math" w:hAnsi="Cambria Math" w:cs="Arial"/>
+                  </w:rPr>
+                  <m:t>-</m:t>
+                </m:r>
+                <m:sSub>
+                  <m:sSubPr>
+                    <m:ctrlPr>
+                      <w:rPr>
+                        <w:rFonts w:ascii="Cambria Math" w:hAnsi="Cambria Math" w:cs="Arial"/>
+                        <w:i/>
+                      </w:rPr>
+                    </m:ctrlPr>
+                  </m:sSubPr>
+                  <m:e>
+                    <m:r>
+                      <w:rPr>
+                        <w:rFonts w:ascii="Cambria Math" w:hAnsi="Cambria Math" w:cs="Arial"/>
+                      </w:rPr>
+                      <m:t>R</m:t>
+                    </m:r>
+                  </m:e>
+                  <m:sub>
+                    <m:d>
+                      <m:dPr>
+                        <m:ctrlPr>
+                          <w:rPr>
+                            <w:rFonts w:ascii="Cambria Math" w:hAnsi="Cambria Math" w:cs="Arial"/>
+                            <w:i/>
+                          </w:rPr>
+                        </m:ctrlPr>
+                      </m:dPr>
+                      <m:e>
+                        <m:r>
+                          <w:rPr>
+                            <w:rFonts w:ascii="Cambria Math" w:hAnsi="Cambria Math" w:cs="Arial"/>
+                          </w:rPr>
+                          <m:t>i-1</m:t>
+                        </m:r>
+                      </m:e>
+                    </m:d>
+                  </m:sub>
+                </m:sSub>
+              </m:e>
+            </m:d>
+            <m:r>
+              <w:rPr>
+                <w:rFonts w:ascii="Cambria Math" w:hAnsi="Cambria Math" w:cs="Arial"/>
+              </w:rPr>
+              <m:t>*</m:t>
+            </m:r>
+            <m:sSub>
+              <m:sSubPr>
+                <m:ctrlPr>
+                  <w:rPr>
+                    <w:rFonts w:ascii="Cambria Math" w:hAnsi="Cambria Math" w:cs="Arial"/>
+                    <w:i/>
+                  </w:rPr>
+                </m:ctrlPr>
+              </m:sSubPr>
+              <m:e>
+                <m:r>
+                  <w:rPr>
+                    <w:rFonts w:ascii="Cambria Math" w:hAnsi="Cambria Math" w:cs="Arial"/>
+                  </w:rPr>
+                  <m:t>P</m:t>
+                </m:r>
+              </m:e>
+              <m:sub>
+                <m:r>
+                  <w:rPr>
+                    <w:rFonts w:ascii="Cambria Math" w:hAnsi="Cambria Math" w:cs="Arial"/>
+                  </w:rPr>
+                  <m:t>i</m:t>
+                </m:r>
+              </m:sub>
+            </m:sSub>
+          </m:e>
+        </m:nary>
+        <m:r>
+          <w:rPr>
+            <w:rFonts w:ascii="Cambria Math" w:hAnsi="Cambria Math" w:cs="Arial"/>
+          </w:rPr>
+          <m:t>, where</m:t>
+        </m:r>
+      </m:oMath>
+    </w:p>
+    <w:p>
+      <w:pPr>
+        <w:pStyle w:val="ListParagraph"/>
+        <w:numPr>
+          <w:ilvl w:val="1"/>
+          <w:numId w:val="3"/>
+        </w:numPr>
+        <w:spacing w:line="480" w:lineRule="auto"/>
+        <w:rPr>
+          <w:rFonts w:cs="Arial"/>
+          <w:i/>
+        </w:rPr>
+      </w:pPr>
+      <w:r>
+        <w:rPr>
+          <w:rFonts w:cs="Arial"/>
+          <w:i/>
+        </w:rPr>
+        <w:t>R</w:t>
+      </w:r>
+      <w:r>
+        <w:rPr>
+          <w:rFonts w:cs="Arial"/>
+          <w:i/>
+          <w:vertAlign w:val="subscript"/>
+        </w:rPr>
+        <w:t>i</w:t>
+      </w:r>
+      <w:r>
+        <w:rPr>
+          <w:rFonts w:cs="Arial"/>
+          <w:i/>
+        </w:rPr>
+        <w:t xml:space="preserve"> </w:t>
+      </w:r>
+      <w:r>
+        <w:rPr>
+          <w:rFonts w:cs="Arial"/>
+          <w:i/>
+        </w:rPr>
+        <w:t>is recall</w:t>
+      </w:r>
+      <w:r>
+        <w:rPr>
+          <w:rFonts w:cs="Arial"/>
+          <w:i/>
+        </w:rPr>
+        <w:t xml:space="preserve"> at point</w:t>
+      </w:r>
+      <w:r>
+        <w:rPr>
+          <w:rFonts w:cs="Arial"/>
+          <w:i/>
+        </w:rPr>
+        <w:t xml:space="preserve"> </w:t>
+      </w:r>
+      <w:proofErr w:type="spellStart"/>
+      <w:r>
+        <w:rPr>
+          <w:rFonts w:cs="Arial"/>
+          <w:i/>
+        </w:rPr>
+        <w:t>i</w:t>
+      </w:r>
+      <w:proofErr w:type="spellEnd"/>
+    </w:p>
+    <w:p>
+      <w:pPr>
+        <w:pStyle w:val="ListParagraph"/>
+        <w:numPr>
+          <w:ilvl w:val="1"/>
+          <w:numId w:val="3"/>
+        </w:numPr>
+        <w:spacing w:line="480" w:lineRule="auto"/>
+        <w:rPr>
+          <w:rFonts w:cs="Arial"/>
+          <w:i/>
+        </w:rPr>
+      </w:pPr>
+      <w:r>
+        <w:rPr>
+          <w:rFonts w:cs="Arial"/>
+          <w:i/>
+        </w:rPr>
+        <w:t>P</w:t>
+      </w:r>
+      <w:r>
+        <w:rPr>
+          <w:rFonts w:cs="Arial"/>
+          <w:i/>
+          <w:vertAlign w:val="subscript"/>
+        </w:rPr>
+        <w:t>i</w:t>
+      </w:r>
+      <w:r>
+        <w:rPr>
+          <w:rFonts w:cs="Arial"/>
+          <w:i/>
+        </w:rPr>
+        <w:t xml:space="preserve"> </w:t>
+      </w:r>
+      <w:r>
+        <w:rPr>
+          <w:rFonts w:cs="Arial"/>
+          <w:i/>
+        </w:rPr>
+        <w:t xml:space="preserve">is </w:t>
+      </w:r>
+      <w:r>
+        <w:rPr>
+          <w:rFonts w:cs="Arial"/>
+          <w:i/>
+        </w:rPr>
+        <w:t>precision at point</w:t>
+      </w:r>
+      <w:r>
+        <w:rPr>
+          <w:rFonts w:cs="Arial"/>
+          <w:i/>
+        </w:rPr>
+        <w:t xml:space="preserve"> </w:t>
+      </w:r>
+      <w:proofErr w:type="spellStart"/>
+      <w:r>
+        <w:rPr>
+          <w:rFonts w:cs="Arial"/>
+          <w:i/>
+        </w:rPr>
+        <w:t>i</w:t>
+      </w:r>
+      <w:proofErr w:type="spellEnd"/>
+    </w:p>
+    <w:p>
+      <w:pPr>
+        <w:spacing w:line="480" w:lineRule="auto"/>
+        <w:ind w:firstLine="720"/>
+        <w:jc w:val="both"/>
+      </w:pPr>
+      <w:r>
+        <w:t>Moreover, to conduct a comparative analysis between the models, f</w:t>
+      </w:r>
+      <w:r>
+        <w:t xml:space="preserve">or each metric, the signed symmetric percentage difference </w:t>
+      </w:r>
+      <w:r>
+        <w:t xml:space="preserve">will be </w:t>
+      </w:r>
+      <w:r>
+        <w:t>calculated</w:t>
+      </w:r>
+      <w:r>
+        <w:t xml:space="preserve"> and</w:t>
+      </w:r>
+      <w:r>
+        <w:t xml:space="preserve"> reflected in Table 3.</w:t>
+      </w:r>
+      <w:r>
+        <w:t xml:space="preserve"> </w:t>
+      </w:r>
+      <w:r>
+        <w:t>The comparison describes the size and direction of the difference and does not determine statistical significance.</w:t>
+      </w:r>
+      <w:r>
+        <w:t xml:space="preserve"> </w:t>
+      </w:r>
+      <w:r>
+        <w:t xml:space="preserve">The </w:t>
+      </w:r>
+      <w:r>
+        <w:t>signed symmetric percentage difference</w:t>
+      </w:r>
+      <w:r>
+        <w:t xml:space="preserve"> will be computed as:</w:t>
+      </w:r>
+    </w:p>
+    <w:p>
+      <w:pPr>
+        <w:pStyle w:val="ListParagraph"/>
+        <w:numPr>
+          <w:ilvl w:val="0"/>
+          <w:numId w:val="4"/>
+        </w:numPr>
+        <w:spacing w:line="480" w:lineRule="auto"/>
+        <w:rPr>
+          <w:rFonts w:cs="Arial"/>
+          <w:i/>
+        </w:rPr>
+      </w:pPr>
+      <m:oMath>
+        <m:r>
+          <w:rPr>
+            <w:rFonts w:ascii="Cambria Math" w:hAnsi="Cambria Math" w:cs="Arial"/>
+          </w:rPr>
+          <w:lastRenderedPageBreak/>
+          <m:t>Percentage Difference=</m:t>
+        </m:r>
+        <m:r>
+          <w:rPr>
+            <w:rFonts w:ascii="Cambria Math" w:hAnsi="Cambria Math" w:cs="Arial"/>
+          </w:rPr>
+          <m:t>100*</m:t>
+        </m:r>
+        <m:f>
+          <m:fPr>
+            <m:ctrlPr>
+              <w:rPr>
+                <w:rFonts w:ascii="Cambria Math" w:hAnsi="Cambria Math" w:cs="Arial"/>
+                <w:i/>
+              </w:rPr>
+            </m:ctrlPr>
+          </m:fPr>
+          <m:num>
+            <m:d>
+              <m:dPr>
+                <m:begChr m:val="|"/>
+                <m:endChr m:val="|"/>
+                <m:ctrlPr>
+                  <w:rPr>
+                    <w:rFonts w:ascii="Cambria Math" w:hAnsi="Cambria Math" w:cs="Arial"/>
+                    <w:i/>
+                  </w:rPr>
+                </m:ctrlPr>
+              </m:dPr>
+              <m:e>
+                <m:r>
+                  <w:rPr>
+                    <w:rFonts w:ascii="Cambria Math" w:hAnsi="Cambria Math" w:cs="Arial"/>
+                  </w:rPr>
+                  <m:t>A-B</m:t>
+                </m:r>
+              </m:e>
+            </m:d>
+          </m:num>
+          <m:den>
+            <m:f>
+              <m:fPr>
+                <m:ctrlPr>
+                  <w:rPr>
+                    <w:rFonts w:ascii="Cambria Math" w:hAnsi="Cambria Math" w:cs="Arial"/>
+                    <w:i/>
+                  </w:rPr>
+                </m:ctrlPr>
+              </m:fPr>
+              <m:num>
+                <m:d>
+                  <m:dPr>
+                    <m:ctrlPr>
+                      <w:rPr>
+                        <w:rFonts w:ascii="Cambria Math" w:hAnsi="Cambria Math" w:cs="Arial"/>
+                        <w:i/>
+                      </w:rPr>
+                    </m:ctrlPr>
+                  </m:dPr>
+                  <m:e>
+                    <m:r>
+                      <w:rPr>
+                        <w:rFonts w:ascii="Cambria Math" w:hAnsi="Cambria Math" w:cs="Arial"/>
+                      </w:rPr>
+                      <m:t>A+B</m:t>
+                    </m:r>
+                  </m:e>
+                </m:d>
+              </m:num>
+              <m:den>
+                <m:r>
+                  <w:rPr>
+                    <w:rFonts w:ascii="Cambria Math" w:hAnsi="Cambria Math" w:cs="Arial"/>
+                  </w:rPr>
+                  <m:t>2</m:t>
+                </m:r>
+              </m:den>
+            </m:f>
+          </m:den>
+        </m:f>
+        <m:r>
+          <w:rPr>
+            <w:rFonts w:ascii="Cambria Math" w:hAnsi="Cambria Math" w:cs="Arial"/>
+          </w:rPr>
+          <m:t>, where</m:t>
+        </m:r>
+      </m:oMath>
+    </w:p>
+    <w:p>
+      <w:pPr>
+        <w:pStyle w:val="ListParagraph"/>
+        <w:numPr>
+          <w:ilvl w:val="1"/>
+          <w:numId w:val="4"/>
+        </w:numPr>
+        <w:spacing w:line="480" w:lineRule="auto"/>
+        <w:rPr>
+          <w:rFonts w:cs="Arial"/>
+          <w:i/>
+        </w:rPr>
+      </w:pPr>
+      <w:r>
+        <w:rPr>
+          <w:rFonts w:cs="Arial"/>
+          <w:i/>
+        </w:rPr>
+        <w:t>A</w:t>
+      </w:r>
+      <w:r>
+        <w:rPr>
+          <w:rFonts w:cs="Arial"/>
+          <w:i/>
+        </w:rPr>
+        <w:t xml:space="preserve"> is </w:t>
+      </w:r>
+      <w:r>
+        <w:rPr>
+          <w:rFonts w:cs="Arial"/>
+          <w:i/>
+        </w:rPr>
+        <w:t>RF-SMOTE metric value</w:t>
+      </w:r>
+    </w:p>
+    <w:p>
+      <w:pPr>
+        <w:pStyle w:val="ListParagraph"/>
+        <w:numPr>
+          <w:ilvl w:val="1"/>
+          <w:numId w:val="4"/>
+        </w:numPr>
+        <w:spacing w:line="480" w:lineRule="auto"/>
+        <w:rPr>
+          <w:rFonts w:cs="Arial"/>
+          <w:i/>
+        </w:rPr>
+      </w:pPr>
+      <w:r>
+        <w:rPr>
+          <w:rFonts w:cs="Arial"/>
+          <w:i/>
+        </w:rPr>
+        <w:t>B</w:t>
+      </w:r>
+      <w:r>
+        <w:rPr>
+          <w:rFonts w:cs="Arial"/>
+          <w:i/>
+        </w:rPr>
+        <w:t xml:space="preserve"> </w:t>
+      </w:r>
+      <w:r>
+        <w:rPr>
+          <w:rFonts w:cs="Arial"/>
+          <w:i/>
+        </w:rPr>
+        <w:t>the benchmark RF metric value</w:t>
+      </w:r>
+    </w:p>
+    <w:p>
+      <w:pPr>
         <w:spacing w:after="0" w:line="480" w:lineRule="auto"/>
         <w:jc w:val="center"/>
       </w:pPr>
       <w:r>
-        <w:t xml:space="preserve">Table </w:t>
-      </w:r>
-      <w:r>
-        <w:t>3</w:t>
+        <w:t>Table 3</w:t>
       </w:r>
     </w:p>
     <w:p>
@@ -788,13 +1800,249 @@
                 <w:sz w:val="16"/>
                 <w:szCs w:val="16"/>
               </w:rPr>
+              <w:t>MCC</w:t>
+            </w:r>
+          </w:p>
+        </w:tc>
+        <w:tc>
+          <w:tcPr>
+            <w:tcW w:w="1114" w:type="dxa"/>
+            <w:tcBorders>
+              <w:top w:val="single" w:sz="4" w:space="0" w:color="auto"/>
+              <w:bottom w:val="single" w:sz="4" w:space="0" w:color="auto"/>
+            </w:tcBorders>
+            <w:shd w:val="clear" w:color="auto" w:fill="D9D9D9" w:themeFill="background1" w:themeFillShade="D9"/>
+            <w:vAlign w:val="center"/>
+          </w:tcPr>
+          <w:p>
+            <w:pPr>
+              <w:spacing w:before="120" w:after="120"/>
+              <w:jc w:val="center"/>
+              <w:rPr>
+                <w:sz w:val="16"/>
+                <w:szCs w:val="16"/>
+              </w:rPr>
+            </w:pPr>
+            <w:r>
+              <w:rPr>
+                <w:sz w:val="16"/>
+                <w:szCs w:val="16"/>
+              </w:rPr>
               <w:t>PR-AUC(%)</w:t>
             </w:r>
           </w:p>
         </w:tc>
+      </w:tr>
+      <w:tr>
+        <w:tc>
+          <w:tcPr>
+            <w:tcW w:w="1768" w:type="dxa"/>
+            <w:tcBorders>
+              <w:top w:val="single" w:sz="4" w:space="0" w:color="auto"/>
+            </w:tcBorders>
+            <w:vAlign w:val="center"/>
+          </w:tcPr>
+          <w:p>
+            <w:pPr>
+              <w:spacing w:before="120" w:after="120"/>
+              <w:ind w:left="216" w:hanging="216"/>
+              <w:rPr>
+                <w:sz w:val="20"/>
+                <w:szCs w:val="20"/>
+              </w:rPr>
+            </w:pPr>
+            <w:r>
+              <w:rPr>
+                <w:sz w:val="20"/>
+                <w:szCs w:val="20"/>
+              </w:rPr>
+              <w:t>Random Forest</w:t>
+            </w:r>
+          </w:p>
+        </w:tc>
+        <w:tc>
+          <w:tcPr>
+            <w:tcW w:w="1599" w:type="dxa"/>
+            <w:tcBorders>
+              <w:top w:val="single" w:sz="4" w:space="0" w:color="auto"/>
+            </w:tcBorders>
+            <w:vAlign w:val="center"/>
+          </w:tcPr>
+          <w:p>
+            <w:pPr>
+              <w:spacing w:before="120" w:after="120"/>
+              <w:jc w:val="center"/>
+            </w:pPr>
+          </w:p>
+        </w:tc>
+        <w:tc>
+          <w:tcPr>
+            <w:tcW w:w="1440" w:type="dxa"/>
+            <w:tcBorders>
+              <w:top w:val="single" w:sz="4" w:space="0" w:color="auto"/>
+            </w:tcBorders>
+            <w:vAlign w:val="center"/>
+          </w:tcPr>
+          <w:p>
+            <w:pPr>
+              <w:spacing w:before="120" w:after="120"/>
+              <w:jc w:val="center"/>
+            </w:pPr>
+          </w:p>
+        </w:tc>
+        <w:tc>
+          <w:tcPr>
+            <w:tcW w:w="1605" w:type="dxa"/>
+            <w:tcBorders>
+              <w:top w:val="single" w:sz="4" w:space="0" w:color="auto"/>
+            </w:tcBorders>
+            <w:vAlign w:val="center"/>
+          </w:tcPr>
+          <w:p>
+            <w:pPr>
+              <w:spacing w:before="120" w:after="120"/>
+              <w:jc w:val="center"/>
+            </w:pPr>
+          </w:p>
+        </w:tc>
         <w:tc>
           <w:tcPr>
             <w:tcW w:w="1114" w:type="dxa"/>
+            <w:tcBorders>
+              <w:top w:val="single" w:sz="4" w:space="0" w:color="auto"/>
+            </w:tcBorders>
+            <w:vAlign w:val="center"/>
+          </w:tcPr>
+          <w:p>
+            <w:pPr>
+              <w:spacing w:before="120" w:after="120"/>
+              <w:jc w:val="center"/>
+            </w:pPr>
+          </w:p>
+        </w:tc>
+        <w:tc>
+          <w:tcPr>
+            <w:tcW w:w="1114" w:type="dxa"/>
+            <w:tcBorders>
+              <w:top w:val="single" w:sz="4" w:space="0" w:color="auto"/>
+            </w:tcBorders>
+            <w:vAlign w:val="center"/>
+          </w:tcPr>
+          <w:p>
+            <w:pPr>
+              <w:spacing w:before="120" w:after="120"/>
+              <w:jc w:val="center"/>
+            </w:pPr>
+          </w:p>
+        </w:tc>
+      </w:tr>
+      <w:tr>
+        <w:tc>
+          <w:tcPr>
+            <w:tcW w:w="1768" w:type="dxa"/>
+            <w:tcBorders>
+              <w:bottom w:val="single" w:sz="4" w:space="0" w:color="auto"/>
+            </w:tcBorders>
+            <w:vAlign w:val="center"/>
+          </w:tcPr>
+          <w:p>
+            <w:pPr>
+              <w:spacing w:before="120" w:after="120"/>
+              <w:ind w:left="216" w:hanging="216"/>
+              <w:rPr>
+                <w:sz w:val="20"/>
+                <w:szCs w:val="20"/>
+              </w:rPr>
+            </w:pPr>
+            <w:r>
+              <w:rPr>
+                <w:sz w:val="20"/>
+                <w:szCs w:val="20"/>
+              </w:rPr>
+              <w:t>Random Forest-SMOTE</w:t>
+            </w:r>
+          </w:p>
+        </w:tc>
+        <w:tc>
+          <w:tcPr>
+            <w:tcW w:w="1599" w:type="dxa"/>
+            <w:tcBorders>
+              <w:bottom w:val="single" w:sz="4" w:space="0" w:color="auto"/>
+            </w:tcBorders>
+            <w:vAlign w:val="center"/>
+          </w:tcPr>
+          <w:p>
+            <w:pPr>
+              <w:spacing w:before="120" w:after="120"/>
+              <w:jc w:val="center"/>
+            </w:pPr>
+          </w:p>
+        </w:tc>
+        <w:tc>
+          <w:tcPr>
+            <w:tcW w:w="1440" w:type="dxa"/>
+            <w:tcBorders>
+              <w:bottom w:val="single" w:sz="4" w:space="0" w:color="auto"/>
+            </w:tcBorders>
+            <w:vAlign w:val="center"/>
+          </w:tcPr>
+          <w:p>
+            <w:pPr>
+              <w:spacing w:before="120" w:after="120"/>
+              <w:jc w:val="center"/>
+            </w:pPr>
+          </w:p>
+        </w:tc>
+        <w:tc>
+          <w:tcPr>
+            <w:tcW w:w="1605" w:type="dxa"/>
+            <w:tcBorders>
+              <w:bottom w:val="single" w:sz="4" w:space="0" w:color="auto"/>
+            </w:tcBorders>
+            <w:vAlign w:val="center"/>
+          </w:tcPr>
+          <w:p>
+            <w:pPr>
+              <w:spacing w:before="120" w:after="120"/>
+              <w:jc w:val="center"/>
+            </w:pPr>
+          </w:p>
+        </w:tc>
+        <w:tc>
+          <w:tcPr>
+            <w:tcW w:w="1114" w:type="dxa"/>
+            <w:tcBorders>
+              <w:bottom w:val="single" w:sz="4" w:space="0" w:color="auto"/>
+            </w:tcBorders>
+            <w:vAlign w:val="center"/>
+          </w:tcPr>
+          <w:p>
+            <w:pPr>
+              <w:spacing w:before="120" w:after="120"/>
+              <w:jc w:val="center"/>
+            </w:pPr>
+          </w:p>
+        </w:tc>
+        <w:tc>
+          <w:tcPr>
+            <w:tcW w:w="1114" w:type="dxa"/>
+            <w:tcBorders>
+              <w:bottom w:val="single" w:sz="4" w:space="0" w:color="auto"/>
+            </w:tcBorders>
+            <w:vAlign w:val="center"/>
+          </w:tcPr>
+          <w:p>
+            <w:pPr>
+              <w:spacing w:before="120" w:after="120"/>
+              <w:jc w:val="center"/>
+            </w:pPr>
+          </w:p>
+        </w:tc>
+      </w:tr>
+      <w:tr>
+        <w:tc>
+          <w:tcPr>
+            <w:tcW w:w="1768" w:type="dxa"/>
             <w:tcBorders>
               <w:top w:val="single" w:sz="4" w:space="0" w:color="auto"/>
               <w:bottom w:val="single" w:sz="4" w:space="0" w:color="auto"/>
@@ -805,34 +2053,6 @@
           <w:p>
             <w:pPr>
               <w:spacing w:before="120" w:after="120"/>
-              <w:jc w:val="center"/>
-              <w:rPr>
-                <w:sz w:val="16"/>
-                <w:szCs w:val="16"/>
-              </w:rPr>
-            </w:pPr>
-            <w:r>
-              <w:rPr>
-                <w:sz w:val="16"/>
-                <w:szCs w:val="16"/>
-              </w:rPr>
-              <w:t>MCC(%)</w:t>
-            </w:r>
-          </w:p>
-        </w:tc>
-      </w:tr>
-      <w:tr>
-        <w:tc>
-          <w:tcPr>
-            <w:tcW w:w="1768" w:type="dxa"/>
-            <w:tcBorders>
-              <w:top w:val="single" w:sz="4" w:space="0" w:color="auto"/>
-            </w:tcBorders>
-            <w:vAlign w:val="center"/>
-          </w:tcPr>
-          <w:p>
-            <w:pPr>
-              <w:spacing w:before="120" w:after="120"/>
               <w:ind w:left="216" w:hanging="216"/>
               <w:rPr>
                 <w:sz w:val="20"/>
@@ -844,193 +2064,13 @@
                 <w:sz w:val="20"/>
                 <w:szCs w:val="20"/>
               </w:rPr>
-              <w:t>Random Forest</w:t>
+              <w:t>Relative Difference</w:t>
             </w:r>
           </w:p>
         </w:tc>
         <w:tc>
           <w:tcPr>
             <w:tcW w:w="1599" w:type="dxa"/>
-            <w:tcBorders>
-              <w:top w:val="single" w:sz="4" w:space="0" w:color="auto"/>
-            </w:tcBorders>
-            <w:vAlign w:val="center"/>
-          </w:tcPr>
-          <w:p>
-            <w:pPr>
-              <w:spacing w:before="120" w:after="120"/>
-              <w:jc w:val="center"/>
-            </w:pPr>
-          </w:p>
-        </w:tc>
-        <w:tc>
-          <w:tcPr>
-            <w:tcW w:w="1440" w:type="dxa"/>
-            <w:tcBorders>
-              <w:top w:val="single" w:sz="4" w:space="0" w:color="auto"/>
-            </w:tcBorders>
-            <w:vAlign w:val="center"/>
-          </w:tcPr>
-          <w:p>
-            <w:pPr>
-              <w:spacing w:before="120" w:after="120"/>
-              <w:jc w:val="center"/>
-            </w:pPr>
-          </w:p>
-        </w:tc>
-        <w:tc>
-          <w:tcPr>
-            <w:tcW w:w="1605" w:type="dxa"/>
-            <w:tcBorders>
-              <w:top w:val="single" w:sz="4" w:space="0" w:color="auto"/>
-            </w:tcBorders>
-            <w:vAlign w:val="center"/>
-          </w:tcPr>
-          <w:p>
-            <w:pPr>
-              <w:spacing w:before="120" w:after="120"/>
-              <w:jc w:val="center"/>
-            </w:pPr>
-          </w:p>
-        </w:tc>
-        <w:tc>
-          <w:tcPr>
-            <w:tcW w:w="1114" w:type="dxa"/>
-            <w:tcBorders>
-              <w:top w:val="single" w:sz="4" w:space="0" w:color="auto"/>
-            </w:tcBorders>
-            <w:vAlign w:val="center"/>
-          </w:tcPr>
-          <w:p>
-            <w:pPr>
-              <w:spacing w:before="120" w:after="120"/>
-              <w:jc w:val="center"/>
-            </w:pPr>
-          </w:p>
-        </w:tc>
-        <w:tc>
-          <w:tcPr>
-            <w:tcW w:w="1114" w:type="dxa"/>
-            <w:tcBorders>
-              <w:top w:val="single" w:sz="4" w:space="0" w:color="auto"/>
-            </w:tcBorders>
-            <w:vAlign w:val="center"/>
-          </w:tcPr>
-          <w:p>
-            <w:pPr>
-              <w:spacing w:before="120" w:after="120"/>
-              <w:jc w:val="center"/>
-            </w:pPr>
-          </w:p>
-        </w:tc>
-      </w:tr>
-      <w:tr>
-        <w:tc>
-          <w:tcPr>
-            <w:tcW w:w="1768" w:type="dxa"/>
-            <w:tcBorders>
-              <w:bottom w:val="single" w:sz="4" w:space="0" w:color="auto"/>
-            </w:tcBorders>
-            <w:vAlign w:val="center"/>
-          </w:tcPr>
-          <w:p>
-            <w:pPr>
-              <w:spacing w:before="120" w:after="120"/>
-              <w:ind w:left="216" w:hanging="216"/>
-              <w:rPr>
-                <w:sz w:val="20"/>
-                <w:szCs w:val="20"/>
-              </w:rPr>
-            </w:pPr>
-            <w:r>
-              <w:rPr>
-                <w:sz w:val="20"/>
-                <w:szCs w:val="20"/>
-              </w:rPr>
-              <w:t>Random Forest-SMOTE</w:t>
-            </w:r>
-          </w:p>
-        </w:tc>
-        <w:tc>
-          <w:tcPr>
-            <w:tcW w:w="1599" w:type="dxa"/>
-            <w:tcBorders>
-              <w:bottom w:val="single" w:sz="4" w:space="0" w:color="auto"/>
-            </w:tcBorders>
-            <w:vAlign w:val="center"/>
-          </w:tcPr>
-          <w:p>
-            <w:pPr>
-              <w:spacing w:before="120" w:after="120"/>
-              <w:jc w:val="center"/>
-            </w:pPr>
-          </w:p>
-        </w:tc>
-        <w:tc>
-          <w:tcPr>
-            <w:tcW w:w="1440" w:type="dxa"/>
-            <w:tcBorders>
-              <w:bottom w:val="single" w:sz="4" w:space="0" w:color="auto"/>
-            </w:tcBorders>
-            <w:vAlign w:val="center"/>
-          </w:tcPr>
-          <w:p>
-            <w:pPr>
-              <w:spacing w:before="120" w:after="120"/>
-              <w:jc w:val="center"/>
-            </w:pPr>
-          </w:p>
-        </w:tc>
-        <w:tc>
-          <w:tcPr>
-            <w:tcW w:w="1605" w:type="dxa"/>
-            <w:tcBorders>
-              <w:bottom w:val="single" w:sz="4" w:space="0" w:color="auto"/>
-            </w:tcBorders>
-            <w:vAlign w:val="center"/>
-          </w:tcPr>
-          <w:p>
-            <w:pPr>
-              <w:spacing w:before="120" w:after="120"/>
-              <w:jc w:val="center"/>
-            </w:pPr>
-          </w:p>
-        </w:tc>
-        <w:tc>
-          <w:tcPr>
-            <w:tcW w:w="1114" w:type="dxa"/>
-            <w:tcBorders>
-              <w:bottom w:val="single" w:sz="4" w:space="0" w:color="auto"/>
-            </w:tcBorders>
-            <w:vAlign w:val="center"/>
-          </w:tcPr>
-          <w:p>
-            <w:pPr>
-              <w:spacing w:before="120" w:after="120"/>
-              <w:jc w:val="center"/>
-            </w:pPr>
-          </w:p>
-        </w:tc>
-        <w:tc>
-          <w:tcPr>
-            <w:tcW w:w="1114" w:type="dxa"/>
-            <w:tcBorders>
-              <w:bottom w:val="single" w:sz="4" w:space="0" w:color="auto"/>
-            </w:tcBorders>
-            <w:vAlign w:val="center"/>
-          </w:tcPr>
-          <w:p>
-            <w:pPr>
-              <w:spacing w:before="120" w:after="120"/>
-              <w:jc w:val="center"/>
-            </w:pPr>
-          </w:p>
-        </w:tc>
-      </w:tr>
-      <w:tr>
-        <w:tc>
-          <w:tcPr>
-            <w:tcW w:w="1768" w:type="dxa"/>
             <w:tcBorders>
               <w:top w:val="single" w:sz="4" w:space="0" w:color="auto"/>
               <w:bottom w:val="single" w:sz="4" w:space="0" w:color="auto"/>
@@ -1041,24 +2081,13 @@
           <w:p>
             <w:pPr>
               <w:spacing w:before="120" w:after="120"/>
-              <w:ind w:left="216" w:hanging="216"/>
-              <w:rPr>
-                <w:sz w:val="20"/>
-                <w:szCs w:val="20"/>
-              </w:rPr>
-            </w:pPr>
-            <w:r>
-              <w:rPr>
-                <w:sz w:val="20"/>
-                <w:szCs w:val="20"/>
-              </w:rPr>
-              <w:t>Relative Difference</w:t>
-            </w:r>
-          </w:p>
-        </w:tc>
-        <w:tc>
-          <w:tcPr>
-            <w:tcW w:w="1599" w:type="dxa"/>
+              <w:jc w:val="center"/>
+            </w:pPr>
+          </w:p>
+        </w:tc>
+        <w:tc>
+          <w:tcPr>
+            <w:tcW w:w="1440" w:type="dxa"/>
             <w:tcBorders>
               <w:top w:val="single" w:sz="4" w:space="0" w:color="auto"/>
               <w:bottom w:val="single" w:sz="4" w:space="0" w:color="auto"/>
@@ -1075,7 +2104,7 @@
         </w:tc>
         <w:tc>
           <w:tcPr>
-            <w:tcW w:w="1440" w:type="dxa"/>
+            <w:tcW w:w="1605" w:type="dxa"/>
             <w:tcBorders>
               <w:top w:val="single" w:sz="4" w:space="0" w:color="auto"/>
               <w:bottom w:val="single" w:sz="4" w:space="0" w:color="auto"/>
@@ -1092,7 +2121,7 @@
         </w:tc>
         <w:tc>
           <w:tcPr>
-            <w:tcW w:w="1605" w:type="dxa"/>
+            <w:tcW w:w="1114" w:type="dxa"/>
             <w:tcBorders>
               <w:top w:val="single" w:sz="4" w:space="0" w:color="auto"/>
               <w:bottom w:val="single" w:sz="4" w:space="0" w:color="auto"/>
@@ -1124,23 +2153,6 @@
             </w:pPr>
           </w:p>
         </w:tc>
-        <w:tc>
-          <w:tcPr>
-            <w:tcW w:w="1114" w:type="dxa"/>
-            <w:tcBorders>
-              <w:top w:val="single" w:sz="4" w:space="0" w:color="auto"/>
-              <w:bottom w:val="single" w:sz="4" w:space="0" w:color="auto"/>
-            </w:tcBorders>
-            <w:shd w:val="clear" w:color="auto" w:fill="D9D9D9" w:themeFill="background1" w:themeFillShade="D9"/>
-            <w:vAlign w:val="center"/>
-          </w:tcPr>
-          <w:p>
-            <w:pPr>
-              <w:spacing w:before="120" w:after="120"/>
-              <w:jc w:val="center"/>
-            </w:pPr>
-          </w:p>
-        </w:tc>
       </w:tr>
     </w:tbl>
     <w:p>
@@ -1158,27 +2170,223 @@
           <w:b/>
           <w:bCs/>
         </w:rPr>
-        <w:lastRenderedPageBreak/>
-        <w:t>Objective:</w:t>
-      </w:r>
-      <w:r>
-        <w:t xml:space="preserve"> To </w:t>
-      </w:r>
-      <w:r>
-        <w:t xml:space="preserve">determine if the performance difference between </w:t>
-      </w:r>
-      <w:r>
-        <w:t xml:space="preserve">the Random Forest-SMOTE (RF-SMOTE) model </w:t>
-      </w:r>
-      <w:r>
-        <w:t>and</w:t>
-      </w:r>
-      <w:r>
-        <w:t xml:space="preserve"> the benchmark Random Forest (RF) model</w:t>
-      </w:r>
-      <w:r>
-        <w:t xml:space="preserve"> is statistically significant.</w:t>
-      </w:r>
+        <w:t>Statistical Significance</w:t>
+      </w:r>
+      <w:r>
+        <w:rPr>
+          <w:b/>
+          <w:bCs/>
+        </w:rPr>
+        <w:t>:</w:t>
+      </w:r>
+      <w:r>
+        <w:t xml:space="preserve"> </w:t>
+      </w:r>
+    </w:p>
+    <w:p>
+      <w:pPr>
+        <w:spacing w:line="480" w:lineRule="auto"/>
+        <w:ind w:firstLine="720"/>
+        <w:jc w:val="both"/>
+      </w:pPr>
+      <w:r>
+        <w:t xml:space="preserve">To </w:t>
+      </w:r>
+      <w:r>
+        <w:t>determines whether there is a significant difference in binary outcomes between two related samples</w:t>
+      </w:r>
+      <w:r>
+        <w:t>,</w:t>
+      </w:r>
+      <w:r>
+        <w:t xml:space="preserve"> </w:t>
+      </w:r>
+      <w:proofErr w:type="spellStart"/>
+      <w:r>
+        <w:t>McNemar’s</w:t>
+      </w:r>
+      <w:proofErr w:type="spellEnd"/>
+      <w:r>
+        <w:t xml:space="preserve"> test will be </w:t>
+      </w:r>
+      <w:r>
+        <w:t xml:space="preserve">used. </w:t>
+      </w:r>
+      <w:r>
+        <w:t xml:space="preserve">Table 4 will summarize </w:t>
+      </w:r>
+      <w:r>
+        <w:t xml:space="preserve">the results in a 2x2 contingency table that compares </w:t>
+      </w:r>
+      <w:r>
+        <w:t>each model’s predicted outcome as:</w:t>
+      </w:r>
+    </w:p>
+    <w:p>
+      <w:pPr>
+        <w:pStyle w:val="ListParagraph"/>
+        <w:numPr>
+          <w:ilvl w:val="0"/>
+          <w:numId w:val="2"/>
+        </w:numPr>
+        <w:spacing w:after="0" w:line="480" w:lineRule="auto"/>
+        <w:jc w:val="both"/>
+        <w:rPr>
+          <w:i/>
+        </w:rPr>
+      </w:pPr>
+      <w:r>
+        <w:rPr>
+          <w:i/>
+        </w:rPr>
+        <w:t>A</w:t>
+      </w:r>
+      <w:r>
+        <w:rPr>
+          <w:i/>
+        </w:rPr>
+        <w:t xml:space="preserve"> are cases</w:t>
+      </w:r>
+      <w:r>
+        <w:rPr>
+          <w:i/>
+        </w:rPr>
+        <w:t xml:space="preserve"> where both models are correct.</w:t>
+      </w:r>
+    </w:p>
+    <w:p>
+      <w:pPr>
+        <w:pStyle w:val="ListParagraph"/>
+        <w:numPr>
+          <w:ilvl w:val="0"/>
+          <w:numId w:val="2"/>
+        </w:numPr>
+        <w:spacing w:after="0" w:line="480" w:lineRule="auto"/>
+        <w:jc w:val="both"/>
+        <w:rPr>
+          <w:i/>
+        </w:rPr>
+      </w:pPr>
+      <w:r>
+        <w:rPr>
+          <w:i/>
+        </w:rPr>
+        <w:t>B</w:t>
+      </w:r>
+      <w:r>
+        <w:rPr>
+          <w:i/>
+        </w:rPr>
+        <w:t xml:space="preserve"> </w:t>
+      </w:r>
+      <w:r>
+        <w:rPr>
+          <w:i/>
+        </w:rPr>
+        <w:t>are cases</w:t>
+      </w:r>
+      <w:r>
+        <w:rPr>
+          <w:i/>
+        </w:rPr>
+        <w:t xml:space="preserve"> where the RF model is correct, but the RF-SMOTE model is incorrect.</w:t>
+      </w:r>
+    </w:p>
+    <w:p>
+      <w:pPr>
+        <w:pStyle w:val="ListParagraph"/>
+        <w:numPr>
+          <w:ilvl w:val="0"/>
+          <w:numId w:val="2"/>
+        </w:numPr>
+        <w:spacing w:after="0" w:line="480" w:lineRule="auto"/>
+        <w:jc w:val="both"/>
+        <w:rPr>
+          <w:i/>
+        </w:rPr>
+      </w:pPr>
+      <w:r>
+        <w:rPr>
+          <w:i/>
+        </w:rPr>
+        <w:t>C</w:t>
+      </w:r>
+      <w:r>
+        <w:rPr>
+          <w:i/>
+        </w:rPr>
+        <w:t xml:space="preserve"> </w:t>
+      </w:r>
+      <w:r>
+        <w:rPr>
+          <w:i/>
+        </w:rPr>
+        <w:t>are cases</w:t>
+      </w:r>
+      <w:r>
+        <w:rPr>
+          <w:i/>
+        </w:rPr>
+        <w:t xml:space="preserve"> where the RF model is incorrect, but the RF-SMOTE model is correct.</w:t>
+      </w:r>
+    </w:p>
+    <w:p>
+      <w:pPr>
+        <w:pStyle w:val="ListParagraph"/>
+        <w:numPr>
+          <w:ilvl w:val="0"/>
+          <w:numId w:val="2"/>
+        </w:numPr>
+        <w:spacing w:line="480" w:lineRule="auto"/>
+        <w:jc w:val="both"/>
+      </w:pPr>
+      <w:proofErr w:type="spellStart"/>
+      <w:r>
+        <w:rPr>
+          <w:i/>
+        </w:rPr>
+        <w:t>D</w:t>
+      </w:r>
+      <w:r>
+        <w:rPr>
+          <w:i/>
+        </w:rPr>
+        <w:t xml:space="preserve"> </w:t>
+      </w:r>
+      <w:r>
+        <w:rPr>
+          <w:i/>
+        </w:rPr>
+        <w:t>are</w:t>
+      </w:r>
+      <w:proofErr w:type="spellEnd"/>
+      <w:r>
+        <w:rPr>
+          <w:i/>
+        </w:rPr>
+        <w:t xml:space="preserve"> cases</w:t>
+      </w:r>
+      <w:r>
+        <w:rPr>
+          <w:i/>
+        </w:rPr>
+        <w:t xml:space="preserve"> where both models are incorrect.</w:t>
+      </w:r>
+      <w:r>
+        <w:t xml:space="preserve"> </w:t>
+      </w:r>
+    </w:p>
+    <w:p>
+      <w:pPr>
+        <w:spacing w:line="480" w:lineRule="auto"/>
+        <w:jc w:val="both"/>
+      </w:pPr>
+    </w:p>
+    <w:p>
+      <w:pPr>
+        <w:spacing w:line="480" w:lineRule="auto"/>
+        <w:jc w:val="both"/>
+      </w:pPr>
     </w:p>
     <w:p>
       <w:pPr>
@@ -1186,10 +2394,8 @@
         <w:jc w:val="center"/>
       </w:pPr>
       <w:r>
-        <w:t xml:space="preserve">Table </w:t>
-      </w:r>
-      <w:r>
-        <w:t>4</w:t>
+        <w:lastRenderedPageBreak/>
+        <w:t>Table 4</w:t>
       </w:r>
     </w:p>
     <w:p>
@@ -1353,10 +2559,17 @@
               <w:spacing w:before="120" w:after="120"/>
               <w:jc w:val="center"/>
               <w:rPr>
-                <w:b/>
-                <w:bCs/>
-              </w:rPr>
-            </w:pPr>
+                <w:i/>
+                <w:iCs/>
+              </w:rPr>
+            </w:pPr>
+            <w:r>
+              <w:rPr>
+                <w:i/>
+                <w:iCs/>
+              </w:rPr>
+              <w:t>A</w:t>
+            </w:r>
           </w:p>
         </w:tc>
         <w:tc>
@@ -1372,7 +2585,18 @@
             <w:pPr>
               <w:spacing w:before="120" w:after="120"/>
               <w:jc w:val="center"/>
-            </w:pPr>
+              <w:rPr>
+                <w:i/>
+                <w:iCs/>
+              </w:rPr>
+            </w:pPr>
+            <w:r>
+              <w:rPr>
+                <w:i/>
+                <w:iCs/>
+              </w:rPr>
+              <w:t>B</w:t>
+            </w:r>
           </w:p>
         </w:tc>
       </w:tr>
@@ -1417,10 +2641,17 @@
               <w:spacing w:before="120" w:after="120"/>
               <w:jc w:val="center"/>
               <w:rPr>
-                <w:b/>
-                <w:bCs/>
-              </w:rPr>
-            </w:pPr>
+                <w:i/>
+                <w:iCs/>
+              </w:rPr>
+            </w:pPr>
+            <w:r>
+              <w:rPr>
+                <w:i/>
+                <w:iCs/>
+              </w:rPr>
+              <w:t>C</w:t>
+            </w:r>
           </w:p>
         </w:tc>
         <w:tc>
@@ -1435,14 +2666,25 @@
             <w:pPr>
               <w:spacing w:before="120" w:after="120"/>
               <w:jc w:val="center"/>
-            </w:pPr>
+              <w:rPr>
+                <w:i/>
+                <w:iCs/>
+              </w:rPr>
+            </w:pPr>
+            <w:r>
+              <w:rPr>
+                <w:i/>
+                <w:iCs/>
+              </w:rPr>
+              <w:t>D</w:t>
+            </w:r>
           </w:p>
         </w:tc>
       </w:tr>
     </w:tbl>
     <w:p>
       <w:pPr>
-        <w:spacing w:after="0" w:line="480" w:lineRule="auto"/>
+        <w:spacing w:line="480" w:lineRule="auto"/>
         <w:rPr>
           <w:b/>
           <w:bCs/>
@@ -1451,14 +2693,186 @@
     </w:p>
     <w:p>
       <w:pPr>
+        <w:spacing w:line="480" w:lineRule="auto"/>
+        <w:ind w:firstLine="720"/>
+        <w:jc w:val="both"/>
+      </w:pPr>
+      <w:r>
+        <w:t>T</w:t>
+      </w:r>
+      <w:r>
+        <w:t xml:space="preserve">he continuity-corrected </w:t>
+      </w:r>
+      <w:proofErr w:type="spellStart"/>
+      <w:r>
+        <w:t>McNemar’s</w:t>
+      </w:r>
+      <w:proofErr w:type="spellEnd"/>
+      <w:r>
+        <w:t xml:space="preserve"> test formula</w:t>
+      </w:r>
+      <w:r>
+        <w:t xml:space="preserve"> will be then calculated. Then t</w:t>
+      </w:r>
+      <w:r>
+        <w:t xml:space="preserve">he computed p-value from </w:t>
+      </w:r>
+      <w:proofErr w:type="spellStart"/>
+      <w:r>
+        <w:t>McNemar’s</w:t>
+      </w:r>
+      <w:proofErr w:type="spellEnd"/>
+      <w:r>
+        <w:t xml:space="preserve"> test will then be compared with the significance level of α = 0.05</w:t>
+      </w:r>
+      <w:r>
+        <w:t xml:space="preserve">. The </w:t>
+      </w:r>
+      <w:r>
+        <w:t xml:space="preserve">continuity-corrected </w:t>
+      </w:r>
+      <w:proofErr w:type="spellStart"/>
+      <w:r>
+        <w:t>McNemar’s</w:t>
+      </w:r>
+      <w:proofErr w:type="spellEnd"/>
+      <w:r>
+        <w:t xml:space="preserve"> test </w:t>
+      </w:r>
+      <w:r>
+        <w:t xml:space="preserve"> </w:t>
+      </w:r>
+      <w:r>
+        <w:t>will be computed as:</w:t>
+      </w:r>
+    </w:p>
+    <w:p>
+      <w:pPr>
+        <w:pStyle w:val="ListParagraph"/>
+        <w:numPr>
+          <w:ilvl w:val="0"/>
+          <w:numId w:val="7"/>
+        </w:numPr>
+        <w:spacing w:line="480" w:lineRule="auto"/>
+        <w:rPr>
+          <w:rFonts w:cs="Arial"/>
+          <w:i/>
+        </w:rPr>
+      </w:pPr>
+      <m:oMath>
+        <m:sSup>
+          <m:sSupPr>
+            <m:ctrlPr>
+              <w:rPr>
+                <w:rFonts w:ascii="Cambria Math" w:hAnsi="Cambria Math" w:cs="Arial"/>
+                <w:i/>
+              </w:rPr>
+            </m:ctrlPr>
+          </m:sSupPr>
+          <m:e>
+            <m:r>
+              <w:rPr>
+                <w:rFonts w:ascii="Cambria Math" w:hAnsi="Cambria Math" w:cs="Arial"/>
+              </w:rPr>
+              <m:t>x</m:t>
+            </m:r>
+          </m:e>
+          <m:sup>
+            <m:r>
+              <w:rPr>
+                <w:rFonts w:ascii="Cambria Math" w:hAnsi="Cambria Math" w:cs="Arial"/>
+              </w:rPr>
+              <m:t>2</m:t>
+            </m:r>
+          </m:sup>
+        </m:sSup>
+        <m:r>
+          <w:rPr>
+            <w:rFonts w:ascii="Cambria Math" w:hAnsi="Cambria Math" w:cs="Arial"/>
+          </w:rPr>
+          <m:t>=</m:t>
+        </m:r>
+        <m:f>
+          <m:fPr>
+            <m:ctrlPr>
+              <w:rPr>
+                <w:rFonts w:ascii="Cambria Math" w:hAnsi="Cambria Math" w:cs="Arial"/>
+                <w:i/>
+              </w:rPr>
+            </m:ctrlPr>
+          </m:fPr>
+          <m:num>
+            <m:sSup>
+              <m:sSupPr>
+                <m:ctrlPr>
+                  <w:rPr>
+                    <w:rFonts w:ascii="Cambria Math" w:hAnsi="Cambria Math" w:cs="Arial"/>
+                    <w:i/>
+                  </w:rPr>
+                </m:ctrlPr>
+              </m:sSupPr>
+              <m:e>
+                <m:r>
+                  <w:rPr>
+                    <w:rFonts w:ascii="Cambria Math" w:hAnsi="Cambria Math" w:cs="Arial"/>
+                  </w:rPr>
+                  <m:t>(</m:t>
+                </m:r>
+                <m:d>
+                  <m:dPr>
+                    <m:begChr m:val="|"/>
+                    <m:endChr m:val="|"/>
+                    <m:ctrlPr>
+                      <w:rPr>
+                        <w:rFonts w:ascii="Cambria Math" w:hAnsi="Cambria Math" w:cs="Arial"/>
+                        <w:i/>
+                      </w:rPr>
+                    </m:ctrlPr>
+                  </m:dPr>
+                  <m:e>
+                    <m:r>
+                      <w:rPr>
+                        <w:rFonts w:ascii="Cambria Math" w:hAnsi="Cambria Math" w:cs="Arial"/>
+                      </w:rPr>
+                      <m:t>B-C</m:t>
+                    </m:r>
+                  </m:e>
+                </m:d>
+                <m:r>
+                  <w:rPr>
+                    <w:rFonts w:ascii="Cambria Math" w:hAnsi="Cambria Math" w:cs="Arial"/>
+                  </w:rPr>
+                  <m:t>-1)</m:t>
+                </m:r>
+              </m:e>
+              <m:sup>
+                <m:r>
+                  <w:rPr>
+                    <w:rFonts w:ascii="Cambria Math" w:hAnsi="Cambria Math" w:cs="Arial"/>
+                  </w:rPr>
+                  <m:t>2</m:t>
+                </m:r>
+              </m:sup>
+            </m:sSup>
+          </m:num>
+          <m:den>
+            <m:r>
+              <w:rPr>
+                <w:rFonts w:ascii="Cambria Math" w:hAnsi="Cambria Math" w:cs="Arial"/>
+              </w:rPr>
+              <m:t>B+C</m:t>
+            </m:r>
+          </m:den>
+        </m:f>
+      </m:oMath>
+    </w:p>
+    <w:p>
+      <w:pPr>
         <w:spacing w:after="0" w:line="480" w:lineRule="auto"/>
         <w:jc w:val="center"/>
       </w:pPr>
       <w:r>
-        <w:t xml:space="preserve">Table </w:t>
-      </w:r>
-      <w:r>
-        <w:t>5</w:t>
+        <w:t>Table 5</w:t>
       </w:r>
     </w:p>
     <w:p>
@@ -1611,7 +3025,7 @@
       </w:pPr>
     </w:p>
     <w:sectPr>
-      <w:headerReference w:type="default" r:id="rId6"/>
+      <w:headerReference w:type="default" r:id="rId7"/>
       <w:pgSz w:w="12240" w:h="15840"/>
       <w:pgMar w:top="1440" w:right="1440" w:bottom="1440" w:left="2160" w:header="708" w:footer="708" w:gutter="0"/>
       <w:cols w:space="708"/>
@@ -1691,6 +3105,823 @@
     </w:r>
   </w:p>
 </w:hdr>
+</file>
+
+<file path=word/numbering.xml><?xml version="1.0" encoding="utf-8"?>
+<w:numbering xmlns:wpc="http://schemas.microsoft.com/office/word/2010/wordprocessingCanvas" xmlns:cx="http://schemas.microsoft.com/office/drawing/2014/chartex" xmlns:cx1="http://schemas.microsoft.com/office/drawing/2015/9/8/chartex" xmlns:cx2="http://schemas.microsoft.com/office/drawing/2015/10/21/chartex" xmlns:cx3="http://schemas.microsoft.com/office/drawing/2016/5/9/chartex" xmlns:cx4="http://schemas.microsoft.com/office/drawing/2016/5/10/chartex" xmlns:cx5="http://schemas.microsoft.com/office/drawing/2016/5/11/chartex" xmlns:cx6="http://schemas.microsoft.com/office/drawing/2016/5/12/chartex" xmlns:cx7="http://schemas.microsoft.com/office/drawing/2016/5/13/chartex" xmlns:cx8="http://schemas.microsoft.com/office/drawing/2016/5/14/chartex" xmlns:mc="http://schemas.openxmlformats.org/markup-compatibility/2006" xmlns:aink="http://schemas.microsoft.com/office/drawing/2016/ink" xmlns:am3d="http://schemas.microsoft.com/office/drawing/2017/model3d" xmlns:o="urn:schemas-microsoft-com:office:office" xmlns:r="http://schemas.openxmlformats.org/officeDocument/2006/relationships" xmlns:m="http://schemas.openxmlformats.org/officeDocument/2006/math" xmlns:v="urn:schemas-microsoft-com:vml" xmlns:wp14="http://schemas.microsoft.com/office/word/2010/wordprocessingDrawing" xmlns:wp="http://schemas.openxmlformats.org/drawingml/2006/wordprocessingDrawing" xmlns:w10="urn:schemas-microsoft-com:office:word" xmlns:w="http://schemas.openxmlformats.org/wordprocessingml/2006/main" xmlns:w14="http://schemas.microsoft.com/office/word/2010/wordml" xmlns:w15="http://schemas.microsoft.com/office/word/2012/wordml" xmlns:w16cex="http://schemas.microsoft.com/office/word/2018/wordml/cex" xmlns:w16cid="http://schemas.microsoft.com/office/word/2016/wordml/cid" xmlns:w16="http://schemas.microsoft.com/office/word/2018/wordml" xmlns:w16sdtdh="http://schemas.microsoft.com/office/word/2020/wordml/sdtdatahash" xmlns:w16se="http://schemas.microsoft.com/office/word/2015/wordml/symex" xmlns:wpg="http://schemas.microsoft.com/office/word/2010/wordprocessingGroup" xmlns:wpi="http://schemas.microsoft.com/office/word/2010/wordprocessingInk" xmlns:wne="http://schemas.microsoft.com/office/word/2006/wordml" xmlns:wps="http://schemas.microsoft.com/office/word/2010/wordprocessingShape" mc:Ignorable="w14 w15 w16se w16cid w16 w16cex w16sdtdh wp14">
+  <w:abstractNum w:abstractNumId="0" w15:restartNumberingAfterBreak="0">
+    <w:nsid w:val="11661B29"/>
+    <w:multiLevelType w:val="hybridMultilevel"/>
+    <w:tmpl w:val="6B088E3E"/>
+    <w:lvl w:ilvl="0" w:tplc="34090001">
+      <w:start w:val="1"/>
+      <w:numFmt w:val="bullet"/>
+      <w:lvlText w:val=""/>
+      <w:lvlJc w:val="left"/>
+      <w:pPr>
+        <w:ind w:left="720" w:hanging="360"/>
+      </w:pPr>
+      <w:rPr>
+        <w:rFonts w:ascii="Symbol" w:hAnsi="Symbol" w:hint="default"/>
+      </w:rPr>
+    </w:lvl>
+    <w:lvl w:ilvl="1" w:tplc="34090003" w:tentative="1">
+      <w:start w:val="1"/>
+      <w:numFmt w:val="bullet"/>
+      <w:lvlText w:val="o"/>
+      <w:lvlJc w:val="left"/>
+      <w:pPr>
+        <w:ind w:left="1440" w:hanging="360"/>
+      </w:pPr>
+      <w:rPr>
+        <w:rFonts w:ascii="Courier New" w:hAnsi="Courier New" w:cs="Courier New" w:hint="default"/>
+      </w:rPr>
+    </w:lvl>
+    <w:lvl w:ilvl="2" w:tplc="34090005" w:tentative="1">
+      <w:start w:val="1"/>
+      <w:numFmt w:val="bullet"/>
+      <w:lvlText w:val=""/>
+      <w:lvlJc w:val="left"/>
+      <w:pPr>
+        <w:ind w:left="2160" w:hanging="360"/>
+      </w:pPr>
+      <w:rPr>
+        <w:rFonts w:ascii="Wingdings" w:hAnsi="Wingdings" w:hint="default"/>
+      </w:rPr>
+    </w:lvl>
+    <w:lvl w:ilvl="3" w:tplc="34090001" w:tentative="1">
+      <w:start w:val="1"/>
+      <w:numFmt w:val="bullet"/>
+      <w:lvlText w:val=""/>
+      <w:lvlJc w:val="left"/>
+      <w:pPr>
+        <w:ind w:left="2880" w:hanging="360"/>
+      </w:pPr>
+      <w:rPr>
+        <w:rFonts w:ascii="Symbol" w:hAnsi="Symbol" w:hint="default"/>
+      </w:rPr>
+    </w:lvl>
+    <w:lvl w:ilvl="4" w:tplc="34090003" w:tentative="1">
+      <w:start w:val="1"/>
+      <w:numFmt w:val="bullet"/>
+      <w:lvlText w:val="o"/>
+      <w:lvlJc w:val="left"/>
+      <w:pPr>
+        <w:ind w:left="3600" w:hanging="360"/>
+      </w:pPr>
+      <w:rPr>
+        <w:rFonts w:ascii="Courier New" w:hAnsi="Courier New" w:cs="Courier New" w:hint="default"/>
+      </w:rPr>
+    </w:lvl>
+    <w:lvl w:ilvl="5" w:tplc="34090005" w:tentative="1">
+      <w:start w:val="1"/>
+      <w:numFmt w:val="bullet"/>
+      <w:lvlText w:val=""/>
+      <w:lvlJc w:val="left"/>
+      <w:pPr>
+        <w:ind w:left="4320" w:hanging="360"/>
+      </w:pPr>
+      <w:rPr>
+        <w:rFonts w:ascii="Wingdings" w:hAnsi="Wingdings" w:hint="default"/>
+      </w:rPr>
+    </w:lvl>
+    <w:lvl w:ilvl="6" w:tplc="34090001" w:tentative="1">
+      <w:start w:val="1"/>
+      <w:numFmt w:val="bullet"/>
+      <w:lvlText w:val=""/>
+      <w:lvlJc w:val="left"/>
+      <w:pPr>
+        <w:ind w:left="5040" w:hanging="360"/>
+      </w:pPr>
+      <w:rPr>
+        <w:rFonts w:ascii="Symbol" w:hAnsi="Symbol" w:hint="default"/>
+      </w:rPr>
+    </w:lvl>
+    <w:lvl w:ilvl="7" w:tplc="34090003" w:tentative="1">
+      <w:start w:val="1"/>
+      <w:numFmt w:val="bullet"/>
+      <w:lvlText w:val="o"/>
+      <w:lvlJc w:val="left"/>
+      <w:pPr>
+        <w:ind w:left="5760" w:hanging="360"/>
+      </w:pPr>
+      <w:rPr>
+        <w:rFonts w:ascii="Courier New" w:hAnsi="Courier New" w:cs="Courier New" w:hint="default"/>
+      </w:rPr>
+    </w:lvl>
+    <w:lvl w:ilvl="8" w:tplc="34090005" w:tentative="1">
+      <w:start w:val="1"/>
+      <w:numFmt w:val="bullet"/>
+      <w:lvlText w:val=""/>
+      <w:lvlJc w:val="left"/>
+      <w:pPr>
+        <w:ind w:left="6480" w:hanging="360"/>
+      </w:pPr>
+      <w:rPr>
+        <w:rFonts w:ascii="Wingdings" w:hAnsi="Wingdings" w:hint="default"/>
+      </w:rPr>
+    </w:lvl>
+  </w:abstractNum>
+  <w:abstractNum w:abstractNumId="1" w15:restartNumberingAfterBreak="0">
+    <w:nsid w:val="34DF0B17"/>
+    <w:multiLevelType w:val="hybridMultilevel"/>
+    <w:tmpl w:val="35A8EAFA"/>
+    <w:lvl w:ilvl="0" w:tplc="34090001">
+      <w:start w:val="1"/>
+      <w:numFmt w:val="bullet"/>
+      <w:lvlText w:val=""/>
+      <w:lvlJc w:val="left"/>
+      <w:pPr>
+        <w:ind w:left="720" w:hanging="360"/>
+      </w:pPr>
+      <w:rPr>
+        <w:rFonts w:ascii="Symbol" w:hAnsi="Symbol" w:hint="default"/>
+      </w:rPr>
+    </w:lvl>
+    <w:lvl w:ilvl="1" w:tplc="34090003" w:tentative="1">
+      <w:start w:val="1"/>
+      <w:numFmt w:val="bullet"/>
+      <w:lvlText w:val="o"/>
+      <w:lvlJc w:val="left"/>
+      <w:pPr>
+        <w:ind w:left="1440" w:hanging="360"/>
+      </w:pPr>
+      <w:rPr>
+        <w:rFonts w:ascii="Courier New" w:hAnsi="Courier New" w:cs="Courier New" w:hint="default"/>
+      </w:rPr>
+    </w:lvl>
+    <w:lvl w:ilvl="2" w:tplc="34090005" w:tentative="1">
+      <w:start w:val="1"/>
+      <w:numFmt w:val="bullet"/>
+      <w:lvlText w:val=""/>
+      <w:lvlJc w:val="left"/>
+      <w:pPr>
+        <w:ind w:left="2160" w:hanging="360"/>
+      </w:pPr>
+      <w:rPr>
+        <w:rFonts w:ascii="Wingdings" w:hAnsi="Wingdings" w:hint="default"/>
+      </w:rPr>
+    </w:lvl>
+    <w:lvl w:ilvl="3" w:tplc="34090001" w:tentative="1">
+      <w:start w:val="1"/>
+      <w:numFmt w:val="bullet"/>
+      <w:lvlText w:val=""/>
+      <w:lvlJc w:val="left"/>
+      <w:pPr>
+        <w:ind w:left="2880" w:hanging="360"/>
+      </w:pPr>
+      <w:rPr>
+        <w:rFonts w:ascii="Symbol" w:hAnsi="Symbol" w:hint="default"/>
+      </w:rPr>
+    </w:lvl>
+    <w:lvl w:ilvl="4" w:tplc="34090003" w:tentative="1">
+      <w:start w:val="1"/>
+      <w:numFmt w:val="bullet"/>
+      <w:lvlText w:val="o"/>
+      <w:lvlJc w:val="left"/>
+      <w:pPr>
+        <w:ind w:left="3600" w:hanging="360"/>
+      </w:pPr>
+      <w:rPr>
+        <w:rFonts w:ascii="Courier New" w:hAnsi="Courier New" w:cs="Courier New" w:hint="default"/>
+      </w:rPr>
+    </w:lvl>
+    <w:lvl w:ilvl="5" w:tplc="34090005" w:tentative="1">
+      <w:start w:val="1"/>
+      <w:numFmt w:val="bullet"/>
+      <w:lvlText w:val=""/>
+      <w:lvlJc w:val="left"/>
+      <w:pPr>
+        <w:ind w:left="4320" w:hanging="360"/>
+      </w:pPr>
+      <w:rPr>
+        <w:rFonts w:ascii="Wingdings" w:hAnsi="Wingdings" w:hint="default"/>
+      </w:rPr>
+    </w:lvl>
+    <w:lvl w:ilvl="6" w:tplc="34090001" w:tentative="1">
+      <w:start w:val="1"/>
+      <w:numFmt w:val="bullet"/>
+      <w:lvlText w:val=""/>
+      <w:lvlJc w:val="left"/>
+      <w:pPr>
+        <w:ind w:left="5040" w:hanging="360"/>
+      </w:pPr>
+      <w:rPr>
+        <w:rFonts w:ascii="Symbol" w:hAnsi="Symbol" w:hint="default"/>
+      </w:rPr>
+    </w:lvl>
+    <w:lvl w:ilvl="7" w:tplc="34090003" w:tentative="1">
+      <w:start w:val="1"/>
+      <w:numFmt w:val="bullet"/>
+      <w:lvlText w:val="o"/>
+      <w:lvlJc w:val="left"/>
+      <w:pPr>
+        <w:ind w:left="5760" w:hanging="360"/>
+      </w:pPr>
+      <w:rPr>
+        <w:rFonts w:ascii="Courier New" w:hAnsi="Courier New" w:cs="Courier New" w:hint="default"/>
+      </w:rPr>
+    </w:lvl>
+    <w:lvl w:ilvl="8" w:tplc="34090005" w:tentative="1">
+      <w:start w:val="1"/>
+      <w:numFmt w:val="bullet"/>
+      <w:lvlText w:val=""/>
+      <w:lvlJc w:val="left"/>
+      <w:pPr>
+        <w:ind w:left="6480" w:hanging="360"/>
+      </w:pPr>
+      <w:rPr>
+        <w:rFonts w:ascii="Wingdings" w:hAnsi="Wingdings" w:hint="default"/>
+      </w:rPr>
+    </w:lvl>
+  </w:abstractNum>
+  <w:abstractNum w:abstractNumId="2" w15:restartNumberingAfterBreak="0">
+    <w:nsid w:val="3C4B5047"/>
+    <w:multiLevelType w:val="hybridMultilevel"/>
+    <w:tmpl w:val="D63C3D6C"/>
+    <w:lvl w:ilvl="0" w:tplc="34090001">
+      <w:start w:val="1"/>
+      <w:numFmt w:val="bullet"/>
+      <w:lvlText w:val=""/>
+      <w:lvlJc w:val="left"/>
+      <w:pPr>
+        <w:ind w:left="720" w:hanging="360"/>
+      </w:pPr>
+      <w:rPr>
+        <w:rFonts w:ascii="Symbol" w:hAnsi="Symbol" w:hint="default"/>
+      </w:rPr>
+    </w:lvl>
+    <w:lvl w:ilvl="1" w:tplc="34090003">
+      <w:start w:val="1"/>
+      <w:numFmt w:val="bullet"/>
+      <w:lvlText w:val="o"/>
+      <w:lvlJc w:val="left"/>
+      <w:pPr>
+        <w:ind w:left="1440" w:hanging="360"/>
+      </w:pPr>
+      <w:rPr>
+        <w:rFonts w:ascii="Courier New" w:hAnsi="Courier New" w:cs="Courier New" w:hint="default"/>
+      </w:rPr>
+    </w:lvl>
+    <w:lvl w:ilvl="2" w:tplc="34090005" w:tentative="1">
+      <w:start w:val="1"/>
+      <w:numFmt w:val="bullet"/>
+      <w:lvlText w:val=""/>
+      <w:lvlJc w:val="left"/>
+      <w:pPr>
+        <w:ind w:left="2160" w:hanging="360"/>
+      </w:pPr>
+      <w:rPr>
+        <w:rFonts w:ascii="Wingdings" w:hAnsi="Wingdings" w:hint="default"/>
+      </w:rPr>
+    </w:lvl>
+    <w:lvl w:ilvl="3" w:tplc="34090001" w:tentative="1">
+      <w:start w:val="1"/>
+      <w:numFmt w:val="bullet"/>
+      <w:lvlText w:val=""/>
+      <w:lvlJc w:val="left"/>
+      <w:pPr>
+        <w:ind w:left="2880" w:hanging="360"/>
+      </w:pPr>
+      <w:rPr>
+        <w:rFonts w:ascii="Symbol" w:hAnsi="Symbol" w:hint="default"/>
+      </w:rPr>
+    </w:lvl>
+    <w:lvl w:ilvl="4" w:tplc="34090003" w:tentative="1">
+      <w:start w:val="1"/>
+      <w:numFmt w:val="bullet"/>
+      <w:lvlText w:val="o"/>
+      <w:lvlJc w:val="left"/>
+      <w:pPr>
+        <w:ind w:left="3600" w:hanging="360"/>
+      </w:pPr>
+      <w:rPr>
+        <w:rFonts w:ascii="Courier New" w:hAnsi="Courier New" w:cs="Courier New" w:hint="default"/>
+      </w:rPr>
+    </w:lvl>
+    <w:lvl w:ilvl="5" w:tplc="34090005" w:tentative="1">
+      <w:start w:val="1"/>
+      <w:numFmt w:val="bullet"/>
+      <w:lvlText w:val=""/>
+      <w:lvlJc w:val="left"/>
+      <w:pPr>
+        <w:ind w:left="4320" w:hanging="360"/>
+      </w:pPr>
+      <w:rPr>
+        <w:rFonts w:ascii="Wingdings" w:hAnsi="Wingdings" w:hint="default"/>
+      </w:rPr>
+    </w:lvl>
+    <w:lvl w:ilvl="6" w:tplc="34090001" w:tentative="1">
+      <w:start w:val="1"/>
+      <w:numFmt w:val="bullet"/>
+      <w:lvlText w:val=""/>
+      <w:lvlJc w:val="left"/>
+      <w:pPr>
+        <w:ind w:left="5040" w:hanging="360"/>
+      </w:pPr>
+      <w:rPr>
+        <w:rFonts w:ascii="Symbol" w:hAnsi="Symbol" w:hint="default"/>
+      </w:rPr>
+    </w:lvl>
+    <w:lvl w:ilvl="7" w:tplc="34090003" w:tentative="1">
+      <w:start w:val="1"/>
+      <w:numFmt w:val="bullet"/>
+      <w:lvlText w:val="o"/>
+      <w:lvlJc w:val="left"/>
+      <w:pPr>
+        <w:ind w:left="5760" w:hanging="360"/>
+      </w:pPr>
+      <w:rPr>
+        <w:rFonts w:ascii="Courier New" w:hAnsi="Courier New" w:cs="Courier New" w:hint="default"/>
+      </w:rPr>
+    </w:lvl>
+    <w:lvl w:ilvl="8" w:tplc="34090005" w:tentative="1">
+      <w:start w:val="1"/>
+      <w:numFmt w:val="bullet"/>
+      <w:lvlText w:val=""/>
+      <w:lvlJc w:val="left"/>
+      <w:pPr>
+        <w:ind w:left="6480" w:hanging="360"/>
+      </w:pPr>
+      <w:rPr>
+        <w:rFonts w:ascii="Wingdings" w:hAnsi="Wingdings" w:hint="default"/>
+      </w:rPr>
+    </w:lvl>
+  </w:abstractNum>
+  <w:abstractNum w:abstractNumId="3" w15:restartNumberingAfterBreak="0">
+    <w:nsid w:val="3FD35359"/>
+    <w:multiLevelType w:val="hybridMultilevel"/>
+    <w:tmpl w:val="843EA75E"/>
+    <w:lvl w:ilvl="0" w:tplc="34090001">
+      <w:start w:val="1"/>
+      <w:numFmt w:val="bullet"/>
+      <w:lvlText w:val=""/>
+      <w:lvlJc w:val="left"/>
+      <w:pPr>
+        <w:ind w:left="720" w:hanging="360"/>
+      </w:pPr>
+      <w:rPr>
+        <w:rFonts w:ascii="Symbol" w:hAnsi="Symbol" w:hint="default"/>
+      </w:rPr>
+    </w:lvl>
+    <w:lvl w:ilvl="1" w:tplc="34090003" w:tentative="1">
+      <w:start w:val="1"/>
+      <w:numFmt w:val="bullet"/>
+      <w:lvlText w:val="o"/>
+      <w:lvlJc w:val="left"/>
+      <w:pPr>
+        <w:ind w:left="1440" w:hanging="360"/>
+      </w:pPr>
+      <w:rPr>
+        <w:rFonts w:ascii="Courier New" w:hAnsi="Courier New" w:cs="Courier New" w:hint="default"/>
+      </w:rPr>
+    </w:lvl>
+    <w:lvl w:ilvl="2" w:tplc="34090005" w:tentative="1">
+      <w:start w:val="1"/>
+      <w:numFmt w:val="bullet"/>
+      <w:lvlText w:val=""/>
+      <w:lvlJc w:val="left"/>
+      <w:pPr>
+        <w:ind w:left="2160" w:hanging="360"/>
+      </w:pPr>
+      <w:rPr>
+        <w:rFonts w:ascii="Wingdings" w:hAnsi="Wingdings" w:hint="default"/>
+      </w:rPr>
+    </w:lvl>
+    <w:lvl w:ilvl="3" w:tplc="34090001" w:tentative="1">
+      <w:start w:val="1"/>
+      <w:numFmt w:val="bullet"/>
+      <w:lvlText w:val=""/>
+      <w:lvlJc w:val="left"/>
+      <w:pPr>
+        <w:ind w:left="2880" w:hanging="360"/>
+      </w:pPr>
+      <w:rPr>
+        <w:rFonts w:ascii="Symbol" w:hAnsi="Symbol" w:hint="default"/>
+      </w:rPr>
+    </w:lvl>
+    <w:lvl w:ilvl="4" w:tplc="34090003" w:tentative="1">
+      <w:start w:val="1"/>
+      <w:numFmt w:val="bullet"/>
+      <w:lvlText w:val="o"/>
+      <w:lvlJc w:val="left"/>
+      <w:pPr>
+        <w:ind w:left="3600" w:hanging="360"/>
+      </w:pPr>
+      <w:rPr>
+        <w:rFonts w:ascii="Courier New" w:hAnsi="Courier New" w:cs="Courier New" w:hint="default"/>
+      </w:rPr>
+    </w:lvl>
+    <w:lvl w:ilvl="5" w:tplc="34090005" w:tentative="1">
+      <w:start w:val="1"/>
+      <w:numFmt w:val="bullet"/>
+      <w:lvlText w:val=""/>
+      <w:lvlJc w:val="left"/>
+      <w:pPr>
+        <w:ind w:left="4320" w:hanging="360"/>
+      </w:pPr>
+      <w:rPr>
+        <w:rFonts w:ascii="Wingdings" w:hAnsi="Wingdings" w:hint="default"/>
+      </w:rPr>
+    </w:lvl>
+    <w:lvl w:ilvl="6" w:tplc="34090001" w:tentative="1">
+      <w:start w:val="1"/>
+      <w:numFmt w:val="bullet"/>
+      <w:lvlText w:val=""/>
+      <w:lvlJc w:val="left"/>
+      <w:pPr>
+        <w:ind w:left="5040" w:hanging="360"/>
+      </w:pPr>
+      <w:rPr>
+        <w:rFonts w:ascii="Symbol" w:hAnsi="Symbol" w:hint="default"/>
+      </w:rPr>
+    </w:lvl>
+    <w:lvl w:ilvl="7" w:tplc="34090003" w:tentative="1">
+      <w:start w:val="1"/>
+      <w:numFmt w:val="bullet"/>
+      <w:lvlText w:val="o"/>
+      <w:lvlJc w:val="left"/>
+      <w:pPr>
+        <w:ind w:left="5760" w:hanging="360"/>
+      </w:pPr>
+      <w:rPr>
+        <w:rFonts w:ascii="Courier New" w:hAnsi="Courier New" w:cs="Courier New" w:hint="default"/>
+      </w:rPr>
+    </w:lvl>
+    <w:lvl w:ilvl="8" w:tplc="34090005" w:tentative="1">
+      <w:start w:val="1"/>
+      <w:numFmt w:val="bullet"/>
+      <w:lvlText w:val=""/>
+      <w:lvlJc w:val="left"/>
+      <w:pPr>
+        <w:ind w:left="6480" w:hanging="360"/>
+      </w:pPr>
+      <w:rPr>
+        <w:rFonts w:ascii="Wingdings" w:hAnsi="Wingdings" w:hint="default"/>
+      </w:rPr>
+    </w:lvl>
+  </w:abstractNum>
+  <w:abstractNum w:abstractNumId="4" w15:restartNumberingAfterBreak="0">
+    <w:nsid w:val="407D3EED"/>
+    <w:multiLevelType w:val="hybridMultilevel"/>
+    <w:tmpl w:val="7F5ED58A"/>
+    <w:lvl w:ilvl="0" w:tplc="34090001">
+      <w:start w:val="1"/>
+      <w:numFmt w:val="bullet"/>
+      <w:lvlText w:val=""/>
+      <w:lvlJc w:val="left"/>
+      <w:pPr>
+        <w:ind w:left="720" w:hanging="360"/>
+      </w:pPr>
+      <w:rPr>
+        <w:rFonts w:ascii="Symbol" w:hAnsi="Symbol" w:hint="default"/>
+      </w:rPr>
+    </w:lvl>
+    <w:lvl w:ilvl="1" w:tplc="34090003" w:tentative="1">
+      <w:start w:val="1"/>
+      <w:numFmt w:val="bullet"/>
+      <w:lvlText w:val="o"/>
+      <w:lvlJc w:val="left"/>
+      <w:pPr>
+        <w:ind w:left="1440" w:hanging="360"/>
+      </w:pPr>
+      <w:rPr>
+        <w:rFonts w:ascii="Courier New" w:hAnsi="Courier New" w:cs="Courier New" w:hint="default"/>
+      </w:rPr>
+    </w:lvl>
+    <w:lvl w:ilvl="2" w:tplc="34090005" w:tentative="1">
+      <w:start w:val="1"/>
+      <w:numFmt w:val="bullet"/>
+      <w:lvlText w:val=""/>
+      <w:lvlJc w:val="left"/>
+      <w:pPr>
+        <w:ind w:left="2160" w:hanging="360"/>
+      </w:pPr>
+      <w:rPr>
+        <w:rFonts w:ascii="Wingdings" w:hAnsi="Wingdings" w:hint="default"/>
+      </w:rPr>
+    </w:lvl>
+    <w:lvl w:ilvl="3" w:tplc="34090001" w:tentative="1">
+      <w:start w:val="1"/>
+      <w:numFmt w:val="bullet"/>
+      <w:lvlText w:val=""/>
+      <w:lvlJc w:val="left"/>
+      <w:pPr>
+        <w:ind w:left="2880" w:hanging="360"/>
+      </w:pPr>
+      <w:rPr>
+        <w:rFonts w:ascii="Symbol" w:hAnsi="Symbol" w:hint="default"/>
+      </w:rPr>
+    </w:lvl>
+    <w:lvl w:ilvl="4" w:tplc="34090003" w:tentative="1">
+      <w:start w:val="1"/>
+      <w:numFmt w:val="bullet"/>
+      <w:lvlText w:val="o"/>
+      <w:lvlJc w:val="left"/>
+      <w:pPr>
+        <w:ind w:left="3600" w:hanging="360"/>
+      </w:pPr>
+      <w:rPr>
+        <w:rFonts w:ascii="Courier New" w:hAnsi="Courier New" w:cs="Courier New" w:hint="default"/>
+      </w:rPr>
+    </w:lvl>
+    <w:lvl w:ilvl="5" w:tplc="34090005" w:tentative="1">
+      <w:start w:val="1"/>
+      <w:numFmt w:val="bullet"/>
+      <w:lvlText w:val=""/>
+      <w:lvlJc w:val="left"/>
+      <w:pPr>
+        <w:ind w:left="4320" w:hanging="360"/>
+      </w:pPr>
+      <w:rPr>
+        <w:rFonts w:ascii="Wingdings" w:hAnsi="Wingdings" w:hint="default"/>
+      </w:rPr>
+    </w:lvl>
+    <w:lvl w:ilvl="6" w:tplc="34090001" w:tentative="1">
+      <w:start w:val="1"/>
+      <w:numFmt w:val="bullet"/>
+      <w:lvlText w:val=""/>
+      <w:lvlJc w:val="left"/>
+      <w:pPr>
+        <w:ind w:left="5040" w:hanging="360"/>
+      </w:pPr>
+      <w:rPr>
+        <w:rFonts w:ascii="Symbol" w:hAnsi="Symbol" w:hint="default"/>
+      </w:rPr>
+    </w:lvl>
+    <w:lvl w:ilvl="7" w:tplc="34090003" w:tentative="1">
+      <w:start w:val="1"/>
+      <w:numFmt w:val="bullet"/>
+      <w:lvlText w:val="o"/>
+      <w:lvlJc w:val="left"/>
+      <w:pPr>
+        <w:ind w:left="5760" w:hanging="360"/>
+      </w:pPr>
+      <w:rPr>
+        <w:rFonts w:ascii="Courier New" w:hAnsi="Courier New" w:cs="Courier New" w:hint="default"/>
+      </w:rPr>
+    </w:lvl>
+    <w:lvl w:ilvl="8" w:tplc="34090005" w:tentative="1">
+      <w:start w:val="1"/>
+      <w:numFmt w:val="bullet"/>
+      <w:lvlText w:val=""/>
+      <w:lvlJc w:val="left"/>
+      <w:pPr>
+        <w:ind w:left="6480" w:hanging="360"/>
+      </w:pPr>
+      <w:rPr>
+        <w:rFonts w:ascii="Wingdings" w:hAnsi="Wingdings" w:hint="default"/>
+      </w:rPr>
+    </w:lvl>
+  </w:abstractNum>
+  <w:abstractNum w:abstractNumId="5" w15:restartNumberingAfterBreak="0">
+    <w:nsid w:val="439310C5"/>
+    <w:multiLevelType w:val="hybridMultilevel"/>
+    <w:tmpl w:val="15ACC16C"/>
+    <w:lvl w:ilvl="0" w:tplc="34090001">
+      <w:start w:val="1"/>
+      <w:numFmt w:val="bullet"/>
+      <w:lvlText w:val=""/>
+      <w:lvlJc w:val="left"/>
+      <w:pPr>
+        <w:ind w:left="720" w:hanging="360"/>
+      </w:pPr>
+      <w:rPr>
+        <w:rFonts w:ascii="Symbol" w:hAnsi="Symbol" w:hint="default"/>
+      </w:rPr>
+    </w:lvl>
+    <w:lvl w:ilvl="1" w:tplc="34090003" w:tentative="1">
+      <w:start w:val="1"/>
+      <w:numFmt w:val="bullet"/>
+      <w:lvlText w:val="o"/>
+      <w:lvlJc w:val="left"/>
+      <w:pPr>
+        <w:ind w:left="1440" w:hanging="360"/>
+      </w:pPr>
+      <w:rPr>
+        <w:rFonts w:ascii="Courier New" w:hAnsi="Courier New" w:cs="Courier New" w:hint="default"/>
+      </w:rPr>
+    </w:lvl>
+    <w:lvl w:ilvl="2" w:tplc="34090005" w:tentative="1">
+      <w:start w:val="1"/>
+      <w:numFmt w:val="bullet"/>
+      <w:lvlText w:val=""/>
+      <w:lvlJc w:val="left"/>
+      <w:pPr>
+        <w:ind w:left="2160" w:hanging="360"/>
+      </w:pPr>
+      <w:rPr>
+        <w:rFonts w:ascii="Wingdings" w:hAnsi="Wingdings" w:hint="default"/>
+      </w:rPr>
+    </w:lvl>
+    <w:lvl w:ilvl="3" w:tplc="34090001" w:tentative="1">
+      <w:start w:val="1"/>
+      <w:numFmt w:val="bullet"/>
+      <w:lvlText w:val=""/>
+      <w:lvlJc w:val="left"/>
+      <w:pPr>
+        <w:ind w:left="2880" w:hanging="360"/>
+      </w:pPr>
+      <w:rPr>
+        <w:rFonts w:ascii="Symbol" w:hAnsi="Symbol" w:hint="default"/>
+      </w:rPr>
+    </w:lvl>
+    <w:lvl w:ilvl="4" w:tplc="34090003" w:tentative="1">
+      <w:start w:val="1"/>
+      <w:numFmt w:val="bullet"/>
+      <w:lvlText w:val="o"/>
+      <w:lvlJc w:val="left"/>
+      <w:pPr>
+        <w:ind w:left="3600" w:hanging="360"/>
+      </w:pPr>
+      <w:rPr>
+        <w:rFonts w:ascii="Courier New" w:hAnsi="Courier New" w:cs="Courier New" w:hint="default"/>
+      </w:rPr>
+    </w:lvl>
+    <w:lvl w:ilvl="5" w:tplc="34090005" w:tentative="1">
+      <w:start w:val="1"/>
+      <w:numFmt w:val="bullet"/>
+      <w:lvlText w:val=""/>
+      <w:lvlJc w:val="left"/>
+      <w:pPr>
+        <w:ind w:left="4320" w:hanging="360"/>
+      </w:pPr>
+      <w:rPr>
+        <w:rFonts w:ascii="Wingdings" w:hAnsi="Wingdings" w:hint="default"/>
+      </w:rPr>
+    </w:lvl>
+    <w:lvl w:ilvl="6" w:tplc="34090001" w:tentative="1">
+      <w:start w:val="1"/>
+      <w:numFmt w:val="bullet"/>
+      <w:lvlText w:val=""/>
+      <w:lvlJc w:val="left"/>
+      <w:pPr>
+        <w:ind w:left="5040" w:hanging="360"/>
+      </w:pPr>
+      <w:rPr>
+        <w:rFonts w:ascii="Symbol" w:hAnsi="Symbol" w:hint="default"/>
+      </w:rPr>
+    </w:lvl>
+    <w:lvl w:ilvl="7" w:tplc="34090003" w:tentative="1">
+      <w:start w:val="1"/>
+      <w:numFmt w:val="bullet"/>
+      <w:lvlText w:val="o"/>
+      <w:lvlJc w:val="left"/>
+      <w:pPr>
+        <w:ind w:left="5760" w:hanging="360"/>
+      </w:pPr>
+      <w:rPr>
+        <w:rFonts w:ascii="Courier New" w:hAnsi="Courier New" w:cs="Courier New" w:hint="default"/>
+      </w:rPr>
+    </w:lvl>
+    <w:lvl w:ilvl="8" w:tplc="34090005" w:tentative="1">
+      <w:start w:val="1"/>
+      <w:numFmt w:val="bullet"/>
+      <w:lvlText w:val=""/>
+      <w:lvlJc w:val="left"/>
+      <w:pPr>
+        <w:ind w:left="6480" w:hanging="360"/>
+      </w:pPr>
+      <w:rPr>
+        <w:rFonts w:ascii="Wingdings" w:hAnsi="Wingdings" w:hint="default"/>
+      </w:rPr>
+    </w:lvl>
+  </w:abstractNum>
+  <w:abstractNum w:abstractNumId="6" w15:restartNumberingAfterBreak="0">
+    <w:nsid w:val="4DF60955"/>
+    <w:multiLevelType w:val="hybridMultilevel"/>
+    <w:tmpl w:val="81566678"/>
+    <w:lvl w:ilvl="0" w:tplc="34090001">
+      <w:start w:val="1"/>
+      <w:numFmt w:val="bullet"/>
+      <w:lvlText w:val=""/>
+      <w:lvlJc w:val="left"/>
+      <w:pPr>
+        <w:ind w:left="720" w:hanging="360"/>
+      </w:pPr>
+      <w:rPr>
+        <w:rFonts w:ascii="Symbol" w:hAnsi="Symbol" w:hint="default"/>
+      </w:rPr>
+    </w:lvl>
+    <w:lvl w:ilvl="1" w:tplc="34090003">
+      <w:start w:val="1"/>
+      <w:numFmt w:val="bullet"/>
+      <w:lvlText w:val="o"/>
+      <w:lvlJc w:val="left"/>
+      <w:pPr>
+        <w:ind w:left="1440" w:hanging="360"/>
+      </w:pPr>
+      <w:rPr>
+        <w:rFonts w:ascii="Courier New" w:hAnsi="Courier New" w:cs="Courier New" w:hint="default"/>
+      </w:rPr>
+    </w:lvl>
+    <w:lvl w:ilvl="2" w:tplc="34090005" w:tentative="1">
+      <w:start w:val="1"/>
+      <w:numFmt w:val="bullet"/>
+      <w:lvlText w:val=""/>
+      <w:lvlJc w:val="left"/>
+      <w:pPr>
+        <w:ind w:left="2160" w:hanging="360"/>
+      </w:pPr>
+      <w:rPr>
+        <w:rFonts w:ascii="Wingdings" w:hAnsi="Wingdings" w:hint="default"/>
+      </w:rPr>
+    </w:lvl>
+    <w:lvl w:ilvl="3" w:tplc="34090001" w:tentative="1">
+      <w:start w:val="1"/>
+      <w:numFmt w:val="bullet"/>
+      <w:lvlText w:val=""/>
+      <w:lvlJc w:val="left"/>
+      <w:pPr>
+        <w:ind w:left="2880" w:hanging="360"/>
+      </w:pPr>
+      <w:rPr>
+        <w:rFonts w:ascii="Symbol" w:hAnsi="Symbol" w:hint="default"/>
+      </w:rPr>
+    </w:lvl>
+    <w:lvl w:ilvl="4" w:tplc="34090003" w:tentative="1">
+      <w:start w:val="1"/>
+      <w:numFmt w:val="bullet"/>
+      <w:lvlText w:val="o"/>
+      <w:lvlJc w:val="left"/>
+      <w:pPr>
+        <w:ind w:left="3600" w:hanging="360"/>
+      </w:pPr>
+      <w:rPr>
+        <w:rFonts w:ascii="Courier New" w:hAnsi="Courier New" w:cs="Courier New" w:hint="default"/>
+      </w:rPr>
+    </w:lvl>
+    <w:lvl w:ilvl="5" w:tplc="34090005" w:tentative="1">
+      <w:start w:val="1"/>
+      <w:numFmt w:val="bullet"/>
+      <w:lvlText w:val=""/>
+      <w:lvlJc w:val="left"/>
+      <w:pPr>
+        <w:ind w:left="4320" w:hanging="360"/>
+      </w:pPr>
+      <w:rPr>
+        <w:rFonts w:ascii="Wingdings" w:hAnsi="Wingdings" w:hint="default"/>
+      </w:rPr>
+    </w:lvl>
+    <w:lvl w:ilvl="6" w:tplc="34090001" w:tentative="1">
+      <w:start w:val="1"/>
+      <w:numFmt w:val="bullet"/>
+      <w:lvlText w:val=""/>
+      <w:lvlJc w:val="left"/>
+      <w:pPr>
+        <w:ind w:left="5040" w:hanging="360"/>
+      </w:pPr>
+      <w:rPr>
+        <w:rFonts w:ascii="Symbol" w:hAnsi="Symbol" w:hint="default"/>
+      </w:rPr>
+    </w:lvl>
+    <w:lvl w:ilvl="7" w:tplc="34090003" w:tentative="1">
+      <w:start w:val="1"/>
+      <w:numFmt w:val="bullet"/>
+      <w:lvlText w:val="o"/>
+      <w:lvlJc w:val="left"/>
+      <w:pPr>
+        <w:ind w:left="5760" w:hanging="360"/>
+      </w:pPr>
+      <w:rPr>
+        <w:rFonts w:ascii="Courier New" w:hAnsi="Courier New" w:cs="Courier New" w:hint="default"/>
+      </w:rPr>
+    </w:lvl>
+    <w:lvl w:ilvl="8" w:tplc="34090005" w:tentative="1">
+      <w:start w:val="1"/>
+      <w:numFmt w:val="bullet"/>
+      <w:lvlText w:val=""/>
+      <w:lvlJc w:val="left"/>
+      <w:pPr>
+        <w:ind w:left="6480" w:hanging="360"/>
+      </w:pPr>
+      <w:rPr>
+        <w:rFonts w:ascii="Wingdings" w:hAnsi="Wingdings" w:hint="default"/>
+      </w:rPr>
+    </w:lvl>
+  </w:abstractNum>
+  <w:num w:numId="1">
+    <w:abstractNumId w:val="5"/>
+  </w:num>
+  <w:num w:numId="2">
+    <w:abstractNumId w:val="4"/>
+  </w:num>
+  <w:num w:numId="3">
+    <w:abstractNumId w:val="2"/>
+  </w:num>
+  <w:num w:numId="4">
+    <w:abstractNumId w:val="6"/>
+  </w:num>
+  <w:num w:numId="5">
+    <w:abstractNumId w:val="1"/>
+  </w:num>
+  <w:num w:numId="6">
+    <w:abstractNumId w:val="0"/>
+  </w:num>
+  <w:num w:numId="7">
+    <w:abstractNumId w:val="3"/>
+  </w:num>
+</w:numbering>
 </file>
 
 <file path=word/styles.xml><?xml version="1.0" encoding="utf-8"?>
@@ -2226,6 +4457,50 @@
       <w:lang w:val="en-PH" w:eastAsia="en-US"/>
     </w:rPr>
   </w:style>
+  <w:style w:type="paragraph" w:styleId="ListParagraph">
+    <w:name w:val="List Paragraph"/>
+    <w:basedOn w:val="Normal"/>
+    <w:uiPriority w:val="34"/>
+    <w:qFormat/>
+    <w:rsid w:val="00C74E77"/>
+    <w:pPr>
+      <w:ind w:left="720"/>
+      <w:contextualSpacing/>
+    </w:pPr>
+  </w:style>
+  <w:style w:type="paragraph" w:styleId="Title">
+    <w:name w:val="Title"/>
+    <w:basedOn w:val="Normal"/>
+    <w:next w:val="Normal"/>
+    <w:link w:val="TitleChar"/>
+    <w:uiPriority w:val="10"/>
+    <w:qFormat/>
+    <w:rsid w:val="004F2BA3"/>
+    <w:pPr>
+      <w:jc w:val="center"/>
+    </w:pPr>
+    <w:rPr>
+      <w:b/>
+      <w:bCs/>
+      <w:sz w:val="28"/>
+      <w:szCs w:val="28"/>
+    </w:rPr>
+  </w:style>
+  <w:style w:type="character" w:customStyle="1" w:styleId="TitleChar">
+    <w:name w:val="Title Char"/>
+    <w:basedOn w:val="DefaultParagraphFont"/>
+    <w:link w:val="Title"/>
+    <w:uiPriority w:val="10"/>
+    <w:rsid w:val="004F2BA3"/>
+    <w:rPr>
+      <w:rFonts w:ascii="Arial" w:eastAsia="Calibri" w:hAnsi="Arial" w:cs="Times New Roman"/>
+      <w:b/>
+      <w:bCs/>
+      <w:sz w:val="28"/>
+      <w:szCs w:val="28"/>
+      <w:lang w:val="en-PH" w:eastAsia="en-US"/>
+    </w:rPr>
+  </w:style>
 </w:styles>
 </file>
 

</xml_diff>